<commit_message>
Model 3: fix maxHistory bridge paths + narrative_updates + optional ensemble + metrics
</commit_message>
<xml_diff>
--- a/model 3 brain.docx
+++ b/model 3 brain.docx
@@ -1489,7 +1489,2048 @@
         <w:t xml:space="preserve"> inside orchestrator.py.</w:t>
       </w:r>
     </w:p>
+    <w:p>
+      <w:r>
+        <w:t xml:space="preserve">To achieve the </w:t>
+      </w:r>
+      <w:r>
+        <w:rPr>
+          <w:b/>
+          <w:bCs/>
+        </w:rPr>
+        <w:t>Ultimate Institutional Hub</w:t>
+      </w:r>
+      <w:r>
+        <w:t xml:space="preserve">, we will shift the "Heavy Lifting" to Kaggle while maintaining the high-density Next.js interface for visualization. This plan transitions your </w:t>
+      </w:r>
+      <w:r>
+        <w:rPr>
+          <w:b/>
+          <w:bCs/>
+        </w:rPr>
+        <w:t>Neural Nexus V15.2</w:t>
+      </w:r>
+      <w:r>
+        <w:t xml:space="preserve"> from a month-end model to a </w:t>
+      </w:r>
+      <w:r>
+        <w:rPr>
+          <w:b/>
+          <w:bCs/>
+        </w:rPr>
+        <w:t>Daily Self-Evolving Brain (1968–2026)</w:t>
+      </w:r>
+      <w:r>
+        <w:t>.</w:t>
+      </w:r>
+    </w:p>
+    <w:p>
+      <w:pPr>
+        <w:rPr>
+          <w:b/>
+          <w:bCs/>
+        </w:rPr>
+      </w:pPr>
+      <w:r>
+        <w:rPr>
+          <w:b/>
+          <w:bCs/>
+        </w:rPr>
+        <w:t>The Model 3 "Neural Nexus" Roadmap</w:t>
+      </w:r>
+    </w:p>
+    <w:p>
+      <w:r>
+        <w:lastRenderedPageBreak/>
+        <w:t xml:space="preserve">We will build the system across two environments: the </w:t>
+      </w:r>
+      <w:r>
+        <w:rPr>
+          <w:b/>
+          <w:bCs/>
+        </w:rPr>
+        <w:t>Kaggle Training Lab</w:t>
+      </w:r>
+      <w:r>
+        <w:t xml:space="preserve"> (Python) and the </w:t>
+      </w:r>
+      <w:r>
+        <w:rPr>
+          <w:b/>
+          <w:bCs/>
+        </w:rPr>
+        <w:t>Intelligence Dashboard</w:t>
+      </w:r>
+      <w:r>
+        <w:t xml:space="preserve"> (Next.js).</w:t>
+      </w:r>
+    </w:p>
+    <w:p>
+      <w:r>
+        <w:pict w14:anchorId="51BDB26F">
+          <v:rect id="_x0000_i1089" style="width:0;height:1.5pt" o:hralign="center" o:hrstd="t" o:hr="t" fillcolor="#a0a0a0" stroked="f"/>
+        </w:pict>
+      </w:r>
+    </w:p>
+    <w:p>
+      <w:pPr>
+        <w:rPr>
+          <w:b/>
+          <w:bCs/>
+        </w:rPr>
+      </w:pPr>
+      <w:r>
+        <w:rPr>
+          <w:b/>
+          <w:bCs/>
+        </w:rPr>
+        <w:t>Phase 1: The Kaggle Training Lab (The Backend)</w:t>
+      </w:r>
+    </w:p>
+    <w:p>
+      <w:r>
+        <w:t>The Brain is divided into three "Lobes," each responsible for a specific dimension of the daily forecast.</w:t>
+      </w:r>
+    </w:p>
+    <w:p>
+      <w:pPr>
+        <w:rPr>
+          <w:b/>
+          <w:bCs/>
+        </w:rPr>
+      </w:pPr>
+      <w:r>
+        <w:rPr>
+          <w:b/>
+          <w:bCs/>
+        </w:rPr>
+        <w:t>Lobe 1: The Structural Lobe (chronos_brain.py)</w:t>
+      </w:r>
+    </w:p>
+    <w:p>
+      <w:pPr>
+        <w:numPr>
+          <w:ilvl w:val="0"/>
+          <w:numId w:val="9"/>
+        </w:numPr>
+      </w:pPr>
+      <w:r>
+        <w:rPr>
+          <w:b/>
+          <w:bCs/>
+        </w:rPr>
+        <w:t>Reasoning</w:t>
+      </w:r>
+      <w:r>
+        <w:t>: This is the "Fundamental" layer. It looks at the 21 macro factors (Yields, DXY, Inflation) and finds the linear and non-linear correlations with the Gold Price.</w:t>
+      </w:r>
+    </w:p>
+    <w:p>
+      <w:pPr>
+        <w:numPr>
+          <w:ilvl w:val="0"/>
+          <w:numId w:val="9"/>
+        </w:numPr>
+      </w:pPr>
+      <w:r>
+        <w:rPr>
+          <w:b/>
+          <w:bCs/>
+        </w:rPr>
+        <w:t>Mathematical Logic</w:t>
+      </w:r>
+      <w:r>
+        <w:t xml:space="preserve">: </w:t>
+      </w:r>
+      <w:r>
+        <w:rPr>
+          <w:b/>
+          <w:bCs/>
+        </w:rPr>
+        <w:t>Ensemble Stacking (</w:t>
+      </w:r>
+      <w:proofErr w:type="spellStart"/>
+      <w:r>
+        <w:rPr>
+          <w:b/>
+          <w:bCs/>
+        </w:rPr>
+        <w:t>XGBoost</w:t>
+      </w:r>
+      <w:proofErr w:type="spellEnd"/>
+      <w:r>
+        <w:rPr>
+          <w:b/>
+          <w:bCs/>
+        </w:rPr>
+        <w:t xml:space="preserve"> + </w:t>
+      </w:r>
+      <w:proofErr w:type="spellStart"/>
+      <w:r>
+        <w:rPr>
+          <w:b/>
+          <w:bCs/>
+        </w:rPr>
+        <w:t>CatBoost</w:t>
+      </w:r>
+      <w:proofErr w:type="spellEnd"/>
+      <w:r>
+        <w:rPr>
+          <w:b/>
+          <w:bCs/>
+        </w:rPr>
+        <w:t xml:space="preserve"> + Ridge)</w:t>
+      </w:r>
+      <w:r>
+        <w:t>.</w:t>
+      </w:r>
+    </w:p>
+    <w:p>
+      <w:pPr>
+        <w:numPr>
+          <w:ilvl w:val="1"/>
+          <w:numId w:val="9"/>
+        </w:numPr>
+      </w:pPr>
+      <w:r>
+        <w:rPr>
+          <w:i/>
+          <w:iCs/>
+        </w:rPr>
+        <w:t>Formula</w:t>
+      </w:r>
+      <w:r>
+        <w:t>: $\hat{y} = w_1 \</w:t>
+      </w:r>
+      <w:proofErr w:type="spellStart"/>
+      <w:r>
+        <w:t>cdot</w:t>
+      </w:r>
+      <w:proofErr w:type="spellEnd"/>
+      <w:r>
+        <w:t xml:space="preserve"> f_{</w:t>
+      </w:r>
+      <w:proofErr w:type="spellStart"/>
+      <w:r>
+        <w:t>xgb</w:t>
+      </w:r>
+      <w:proofErr w:type="spellEnd"/>
+      <w:r>
+        <w:t>}(x) + w_2 \</w:t>
+      </w:r>
+      <w:proofErr w:type="spellStart"/>
+      <w:r>
+        <w:t>cdot</w:t>
+      </w:r>
+      <w:proofErr w:type="spellEnd"/>
+      <w:r>
+        <w:t xml:space="preserve"> f_{cat}(x) + w_3 \</w:t>
+      </w:r>
+      <w:proofErr w:type="spellStart"/>
+      <w:r>
+        <w:t>cdot</w:t>
+      </w:r>
+      <w:proofErr w:type="spellEnd"/>
+      <w:r>
+        <w:t xml:space="preserve"> f_{ridge}(x)$ where $w$ is optimized via </w:t>
+      </w:r>
+      <w:r>
+        <w:rPr>
+          <w:b/>
+          <w:bCs/>
+        </w:rPr>
+        <w:t>Bayesian Search (</w:t>
+      </w:r>
+      <w:proofErr w:type="spellStart"/>
+      <w:r>
+        <w:rPr>
+          <w:b/>
+          <w:bCs/>
+        </w:rPr>
+        <w:t>Optuna</w:t>
+      </w:r>
+      <w:proofErr w:type="spellEnd"/>
+      <w:r>
+        <w:rPr>
+          <w:b/>
+          <w:bCs/>
+        </w:rPr>
+        <w:t>)</w:t>
+      </w:r>
+      <w:r>
+        <w:t>.</w:t>
+      </w:r>
+    </w:p>
+    <w:p>
+      <w:pPr>
+        <w:numPr>
+          <w:ilvl w:val="0"/>
+          <w:numId w:val="9"/>
+        </w:numPr>
+      </w:pPr>
+      <w:r>
+        <w:rPr>
+          <w:b/>
+          <w:bCs/>
+        </w:rPr>
+        <w:t>Output</w:t>
+      </w:r>
+      <w:r>
+        <w:t xml:space="preserve">: </w:t>
+      </w:r>
+      <w:proofErr w:type="spellStart"/>
+      <w:proofErr w:type="gramStart"/>
+      <w:r>
+        <w:t>forecast.json</w:t>
+      </w:r>
+      <w:proofErr w:type="spellEnd"/>
+      <w:proofErr w:type="gramEnd"/>
+      <w:r>
+        <w:t>.</w:t>
+      </w:r>
+    </w:p>
+    <w:p>
+      <w:pPr>
+        <w:numPr>
+          <w:ilvl w:val="1"/>
+          <w:numId w:val="9"/>
+        </w:numPr>
+      </w:pPr>
+      <w:r>
+        <w:rPr>
+          <w:i/>
+          <w:iCs/>
+        </w:rPr>
+        <w:t>Saved Data</w:t>
+      </w:r>
+      <w:r>
+        <w:t xml:space="preserve">: 30-day price prediction, Feature Importance (Coefficients), and </w:t>
+      </w:r>
+      <w:r>
+        <w:rPr>
+          <w:b/>
+          <w:bCs/>
+        </w:rPr>
+        <w:t>BUSA 3 Metrics</w:t>
+      </w:r>
+      <w:r>
+        <w:t xml:space="preserve"> (MAPE, RMSE, MAD).</w:t>
+      </w:r>
+    </w:p>
+    <w:p>
+      <w:pPr>
+        <w:rPr>
+          <w:b/>
+          <w:bCs/>
+        </w:rPr>
+      </w:pPr>
+      <w:r>
+        <w:rPr>
+          <w:b/>
+          <w:bCs/>
+        </w:rPr>
+        <w:t>Lobe 2: The Temporal Lobe (temporal_lobe.py)</w:t>
+      </w:r>
+    </w:p>
+    <w:p>
+      <w:pPr>
+        <w:numPr>
+          <w:ilvl w:val="0"/>
+          <w:numId w:val="10"/>
+        </w:numPr>
+      </w:pPr>
+      <w:r>
+        <w:rPr>
+          <w:b/>
+          <w:bCs/>
+        </w:rPr>
+        <w:t>Reasoning</w:t>
+      </w:r>
+      <w:r>
+        <w:t>: This is the "Momentum" layer. It ignores macro fundamentals and looks purely at price cycles and "Hidden Patterns" in the time series.</w:t>
+      </w:r>
+    </w:p>
+    <w:p>
+      <w:pPr>
+        <w:numPr>
+          <w:ilvl w:val="0"/>
+          <w:numId w:val="10"/>
+        </w:numPr>
+      </w:pPr>
+      <w:r>
+        <w:rPr>
+          <w:b/>
+          <w:bCs/>
+        </w:rPr>
+        <w:t>Mathematical Logic</w:t>
+      </w:r>
+      <w:r>
+        <w:t xml:space="preserve">: </w:t>
+      </w:r>
+      <w:r>
+        <w:rPr>
+          <w:b/>
+          <w:bCs/>
+        </w:rPr>
+        <w:t>Wavelet-Denoised Bi-LSTM with Multi-Head Attention</w:t>
+      </w:r>
+      <w:r>
+        <w:t>.</w:t>
+      </w:r>
+    </w:p>
+    <w:p>
+      <w:pPr>
+        <w:numPr>
+          <w:ilvl w:val="1"/>
+          <w:numId w:val="10"/>
+        </w:numPr>
+      </w:pPr>
+      <w:r>
+        <w:rPr>
+          <w:i/>
+          <w:iCs/>
+        </w:rPr>
+        <w:t>Formula</w:t>
+      </w:r>
+      <w:r>
+        <w:t>: $</w:t>
+      </w:r>
+      <w:proofErr w:type="gramStart"/>
+      <w:r>
+        <w:t>Attention(</w:t>
+      </w:r>
+      <w:proofErr w:type="gramEnd"/>
+      <w:r>
+        <w:t>Q, K, V) = \text{</w:t>
+      </w:r>
+      <w:proofErr w:type="spellStart"/>
+      <w:r>
+        <w:t>softmax</w:t>
+      </w:r>
+      <w:proofErr w:type="spellEnd"/>
+      <w:r>
+        <w:t>}\left(\</w:t>
+      </w:r>
+      <w:proofErr w:type="gramStart"/>
+      <w:r>
+        <w:t>frac{</w:t>
+      </w:r>
+      <w:proofErr w:type="gramEnd"/>
+      <w:r>
+        <w:t>QK^</w:t>
+      </w:r>
+      <w:proofErr w:type="gramStart"/>
+      <w:r>
+        <w:t>T}{</w:t>
+      </w:r>
+      <w:proofErr w:type="gramEnd"/>
+      <w:r>
+        <w:t>\sqrt{</w:t>
+      </w:r>
+      <w:proofErr w:type="spellStart"/>
+      <w:r>
+        <w:t>d_k</w:t>
+      </w:r>
+      <w:proofErr w:type="spellEnd"/>
+      <w:proofErr w:type="gramStart"/>
+      <w:r>
+        <w:t>}}\right)V</w:t>
+      </w:r>
+      <w:proofErr w:type="gramEnd"/>
+      <w:r>
+        <w:t>$. It uses a "Sliding Window" of 60 days to predict day 61.</w:t>
+      </w:r>
+    </w:p>
+    <w:p>
+      <w:pPr>
+        <w:numPr>
+          <w:ilvl w:val="0"/>
+          <w:numId w:val="10"/>
+        </w:numPr>
+      </w:pPr>
+      <w:r>
+        <w:rPr>
+          <w:b/>
+          <w:bCs/>
+        </w:rPr>
+        <w:t>Output</w:t>
+      </w:r>
+      <w:r>
+        <w:t xml:space="preserve">: </w:t>
+      </w:r>
+      <w:proofErr w:type="spellStart"/>
+      <w:r>
+        <w:t>temporal_</w:t>
+      </w:r>
+      <w:proofErr w:type="gramStart"/>
+      <w:r>
+        <w:t>forecast.json</w:t>
+      </w:r>
+      <w:proofErr w:type="spellEnd"/>
+      <w:proofErr w:type="gramEnd"/>
+      <w:r>
+        <w:t>.</w:t>
+      </w:r>
+    </w:p>
+    <w:p>
+      <w:pPr>
+        <w:numPr>
+          <w:ilvl w:val="1"/>
+          <w:numId w:val="10"/>
+        </w:numPr>
+      </w:pPr>
+      <w:r>
+        <w:rPr>
+          <w:i/>
+          <w:iCs/>
+        </w:rPr>
+        <w:t>Saved Data</w:t>
+      </w:r>
+      <w:r>
+        <w:t>: Trend momentum paths and Confidence Intervals (Monte Carlo Dropout).</w:t>
+      </w:r>
+    </w:p>
+    <w:p>
+      <w:pPr>
+        <w:rPr>
+          <w:b/>
+          <w:bCs/>
+        </w:rPr>
+      </w:pPr>
+      <w:r>
+        <w:rPr>
+          <w:b/>
+          <w:bCs/>
+        </w:rPr>
+        <w:t>Lobe 3: The Narrative Lobe (narrative_lobe.py)</w:t>
+      </w:r>
+    </w:p>
+    <w:p>
+      <w:pPr>
+        <w:numPr>
+          <w:ilvl w:val="0"/>
+          <w:numId w:val="11"/>
+        </w:numPr>
+      </w:pPr>
+      <w:r>
+        <w:rPr>
+          <w:b/>
+          <w:bCs/>
+        </w:rPr>
+        <w:t>Reasoning</w:t>
+      </w:r>
+      <w:r>
+        <w:t xml:space="preserve">: This is the "Context" layer. It explains </w:t>
+      </w:r>
+      <w:r>
+        <w:rPr>
+          <w:i/>
+          <w:iCs/>
+        </w:rPr>
+        <w:t>why</w:t>
+      </w:r>
+      <w:r>
+        <w:t xml:space="preserve"> the numbers are moving by analyzing news and geopolitical shifts.</w:t>
+      </w:r>
+    </w:p>
+    <w:p>
+      <w:pPr>
+        <w:numPr>
+          <w:ilvl w:val="0"/>
+          <w:numId w:val="11"/>
+        </w:numPr>
+      </w:pPr>
+      <w:r>
+        <w:rPr>
+          <w:b/>
+          <w:bCs/>
+        </w:rPr>
+        <w:t>Mathematical Logic</w:t>
+      </w:r>
+      <w:r>
+        <w:t xml:space="preserve">: </w:t>
+      </w:r>
+      <w:proofErr w:type="spellStart"/>
+      <w:r>
+        <w:rPr>
+          <w:b/>
+          <w:bCs/>
+        </w:rPr>
+        <w:t>FinBERT</w:t>
+      </w:r>
+      <w:proofErr w:type="spellEnd"/>
+      <w:r>
+        <w:rPr>
+          <w:b/>
+          <w:bCs/>
+        </w:rPr>
+        <w:t xml:space="preserve"> Sentiment Scoring</w:t>
+      </w:r>
+      <w:r>
+        <w:t>.</w:t>
+      </w:r>
+    </w:p>
+    <w:p>
+      <w:pPr>
+        <w:numPr>
+          <w:ilvl w:val="1"/>
+          <w:numId w:val="11"/>
+        </w:numPr>
+      </w:pPr>
+      <w:r>
+        <w:rPr>
+          <w:i/>
+          <w:iCs/>
+        </w:rPr>
+        <w:lastRenderedPageBreak/>
+        <w:t>Formula</w:t>
+      </w:r>
+      <w:r>
+        <w:t>: $Score = \frac{\</w:t>
+      </w:r>
+      <w:proofErr w:type="gramStart"/>
+      <w:r>
+        <w:t>text{</w:t>
+      </w:r>
+      <w:proofErr w:type="gramEnd"/>
+      <w:r>
+        <w:t>Pos} - \</w:t>
+      </w:r>
+      <w:proofErr w:type="gramStart"/>
+      <w:r>
+        <w:t>text{</w:t>
+      </w:r>
+      <w:proofErr w:type="gramEnd"/>
+      <w:r>
+        <w:t>Neg</w:t>
+      </w:r>
+      <w:proofErr w:type="gramStart"/>
+      <w:r>
+        <w:t>}}{</w:t>
+      </w:r>
+      <w:proofErr w:type="gramEnd"/>
+      <w:r>
+        <w:t>\</w:t>
+      </w:r>
+      <w:proofErr w:type="gramStart"/>
+      <w:r>
+        <w:t>text{</w:t>
+      </w:r>
+      <w:proofErr w:type="gramEnd"/>
+      <w:r>
+        <w:t>Total</w:t>
+      </w:r>
+      <w:proofErr w:type="gramStart"/>
+      <w:r>
+        <w:t>}}$</w:t>
+      </w:r>
+      <w:proofErr w:type="gramEnd"/>
+      <w:r>
+        <w:t xml:space="preserve">. Aggregated daily from </w:t>
+      </w:r>
+      <w:proofErr w:type="spellStart"/>
+      <w:r>
+        <w:t>GNews</w:t>
+      </w:r>
+      <w:proofErr w:type="spellEnd"/>
+      <w:r>
+        <w:t xml:space="preserve"> and FRED announcements.</w:t>
+      </w:r>
+    </w:p>
+    <w:p>
+      <w:pPr>
+        <w:numPr>
+          <w:ilvl w:val="0"/>
+          <w:numId w:val="11"/>
+        </w:numPr>
+      </w:pPr>
+      <w:r>
+        <w:rPr>
+          <w:b/>
+          <w:bCs/>
+        </w:rPr>
+        <w:t>Output</w:t>
+      </w:r>
+      <w:r>
+        <w:t xml:space="preserve">: </w:t>
+      </w:r>
+      <w:proofErr w:type="spellStart"/>
+      <w:r>
+        <w:t>narrative_</w:t>
+      </w:r>
+      <w:proofErr w:type="gramStart"/>
+      <w:r>
+        <w:t>updates.json</w:t>
+      </w:r>
+      <w:proofErr w:type="spellEnd"/>
+      <w:proofErr w:type="gramEnd"/>
+      <w:r>
+        <w:t>.</w:t>
+      </w:r>
+    </w:p>
+    <w:p>
+      <w:pPr>
+        <w:numPr>
+          <w:ilvl w:val="1"/>
+          <w:numId w:val="11"/>
+        </w:numPr>
+      </w:pPr>
+      <w:r>
+        <w:rPr>
+          <w:i/>
+          <w:iCs/>
+        </w:rPr>
+        <w:t>Saved Data</w:t>
+      </w:r>
+      <w:r>
+        <w:t>: Daily "Managerial Insights" and impact labels (e.g., "Bullish: Geopolitical Spike").</w:t>
+      </w:r>
+    </w:p>
+    <w:p>
+      <w:r>
+        <w:pict w14:anchorId="7573282F">
+          <v:rect id="_x0000_i1090" style="width:0;height:1.5pt" o:hralign="center" o:hrstd="t" o:hr="t" fillcolor="#a0a0a0" stroked="f"/>
+        </w:pict>
+      </w:r>
+    </w:p>
+    <w:p>
+      <w:pPr>
+        <w:rPr>
+          <w:b/>
+          <w:bCs/>
+        </w:rPr>
+      </w:pPr>
+      <w:r>
+        <w:rPr>
+          <w:b/>
+          <w:bCs/>
+        </w:rPr>
+        <w:t>Phase 2: The Data Bridge (The "Join")</w:t>
+      </w:r>
+    </w:p>
+    <w:p>
+      <w:r>
+        <w:t xml:space="preserve">To eliminate manual file copying, we will implement the </w:t>
+      </w:r>
+      <w:r>
+        <w:rPr>
+          <w:b/>
+          <w:bCs/>
+        </w:rPr>
+        <w:t>Automated GitHub Deployment Bridge</w:t>
+      </w:r>
+      <w:r>
+        <w:t xml:space="preserve"> inside Kaggle:</w:t>
+      </w:r>
+    </w:p>
+    <w:p>
+      <w:pPr>
+        <w:numPr>
+          <w:ilvl w:val="0"/>
+          <w:numId w:val="12"/>
+        </w:numPr>
+      </w:pPr>
+      <w:r>
+        <w:rPr>
+          <w:b/>
+          <w:bCs/>
+        </w:rPr>
+        <w:t>Ingestion</w:t>
+      </w:r>
+      <w:r>
+        <w:t>: Python scripts pull from FRED/Yahoo Finance APIs and read your 4 uploaded Local CSVs.</w:t>
+      </w:r>
+    </w:p>
+    <w:p>
+      <w:pPr>
+        <w:numPr>
+          <w:ilvl w:val="0"/>
+          <w:numId w:val="12"/>
+        </w:numPr>
+      </w:pPr>
+      <w:r>
+        <w:rPr>
+          <w:b/>
+          <w:bCs/>
+        </w:rPr>
+        <w:t>Processing</w:t>
+      </w:r>
+      <w:r>
+        <w:t>: The 3 Lobes run sequentially.</w:t>
+      </w:r>
+    </w:p>
+    <w:p>
+      <w:pPr>
+        <w:numPr>
+          <w:ilvl w:val="0"/>
+          <w:numId w:val="12"/>
+        </w:numPr>
+      </w:pPr>
+      <w:r>
+        <w:rPr>
+          <w:b/>
+          <w:bCs/>
+        </w:rPr>
+        <w:t>Synthesis</w:t>
+      </w:r>
+      <w:r>
+        <w:t>: An orchestrator.py combines outputs into 3 JSON files.</w:t>
+      </w:r>
+    </w:p>
+    <w:p>
+      <w:pPr>
+        <w:numPr>
+          <w:ilvl w:val="0"/>
+          <w:numId w:val="12"/>
+        </w:numPr>
+      </w:pPr>
+      <w:r>
+        <w:rPr>
+          <w:b/>
+          <w:bCs/>
+        </w:rPr>
+        <w:t>Automatic Push</w:t>
+      </w:r>
+      <w:r>
+        <w:t>: We will add a Git script to the end of the Kaggle notebook.</w:t>
+      </w:r>
+    </w:p>
+    <w:p>
+      <w:pPr>
+        <w:numPr>
+          <w:ilvl w:val="1"/>
+          <w:numId w:val="12"/>
+        </w:numPr>
+      </w:pPr>
+      <w:r>
+        <w:rPr>
+          <w:i/>
+          <w:iCs/>
+        </w:rPr>
+        <w:t>Logic</w:t>
+      </w:r>
+      <w:r>
+        <w:t xml:space="preserve">: git </w:t>
+      </w:r>
+      <w:proofErr w:type="gramStart"/>
+      <w:r>
+        <w:t>add .</w:t>
+      </w:r>
+      <w:proofErr w:type="gramEnd"/>
+      <w:r>
+        <w:t xml:space="preserve"> -&gt; git commit -&gt; git push to your GitHub repository using a </w:t>
+      </w:r>
+      <w:r>
+        <w:rPr>
+          <w:b/>
+          <w:bCs/>
+        </w:rPr>
+        <w:t>Personal Access Token</w:t>
+      </w:r>
+      <w:r>
+        <w:t>.</w:t>
+      </w:r>
+    </w:p>
+    <w:p>
+      <w:pPr>
+        <w:numPr>
+          <w:ilvl w:val="0"/>
+          <w:numId w:val="12"/>
+        </w:numPr>
+      </w:pPr>
+      <w:r>
+        <w:rPr>
+          <w:b/>
+          <w:bCs/>
+        </w:rPr>
+        <w:t>Frontend Sync</w:t>
+      </w:r>
+      <w:r>
+        <w:t xml:space="preserve">: Your Next.js site (on </w:t>
+      </w:r>
+      <w:proofErr w:type="spellStart"/>
+      <w:r>
+        <w:t>Vercel</w:t>
+      </w:r>
+      <w:proofErr w:type="spellEnd"/>
+      <w:r>
+        <w:t xml:space="preserve">) is connected to that same GitHub repo. It automatically detects the new JSON files and updates the </w:t>
+      </w:r>
+      <w:r>
+        <w:rPr>
+          <w:b/>
+          <w:bCs/>
+        </w:rPr>
+        <w:t>HUDs</w:t>
+      </w:r>
+      <w:r>
+        <w:t xml:space="preserve">, </w:t>
+      </w:r>
+      <w:r>
+        <w:rPr>
+          <w:b/>
+          <w:bCs/>
+        </w:rPr>
+        <w:t>Matrix Table</w:t>
+      </w:r>
+      <w:r>
+        <w:t xml:space="preserve">, and </w:t>
+      </w:r>
+      <w:r>
+        <w:rPr>
+          <w:b/>
+          <w:bCs/>
+        </w:rPr>
+        <w:t>Chatbot</w:t>
+      </w:r>
+      <w:r>
+        <w:t xml:space="preserve"> instantly.</w:t>
+      </w:r>
+    </w:p>
+    <w:p>
+      <w:r>
+        <w:pict w14:anchorId="5DD98770">
+          <v:rect id="_x0000_i1091" style="width:0;height:1.5pt" o:hralign="center" o:hrstd="t" o:hr="t" fillcolor="#a0a0a0" stroked="f"/>
+        </w:pict>
+      </w:r>
+    </w:p>
+    <w:p>
+      <w:pPr>
+        <w:rPr>
+          <w:b/>
+          <w:bCs/>
+        </w:rPr>
+      </w:pPr>
+      <w:r>
+        <w:rPr>
+          <w:b/>
+          <w:bCs/>
+        </w:rPr>
+        <w:t>Phase 3: Dashboard &amp; Chatbot Integration (The Frontend)</w:t>
+      </w:r>
+    </w:p>
+    <w:p>
+      <w:r>
+        <w:t xml:space="preserve">The dashboard will be updated to include the </w:t>
+      </w:r>
+      <w:r>
+        <w:rPr>
+          <w:b/>
+          <w:bCs/>
+        </w:rPr>
+        <w:t>Interactive Accuracy HUD</w:t>
+      </w:r>
+      <w:r>
+        <w:t xml:space="preserve"> and the </w:t>
+      </w:r>
+      <w:r>
+        <w:rPr>
+          <w:b/>
+          <w:bCs/>
+        </w:rPr>
+        <w:t>AI Chatbot</w:t>
+      </w:r>
+      <w:r>
+        <w:t>.</w:t>
+      </w:r>
+    </w:p>
+    <w:p>
+      <w:pPr>
+        <w:numPr>
+          <w:ilvl w:val="0"/>
+          <w:numId w:val="13"/>
+        </w:numPr>
+      </w:pPr>
+      <w:r>
+        <w:rPr>
+          <w:b/>
+          <w:bCs/>
+        </w:rPr>
+        <w:t>Accuracy HUD</w:t>
+      </w:r>
+      <w:r>
+        <w:t>: Displays the MAPE and RMSE calculated by the Structural Lobe.</w:t>
+      </w:r>
+    </w:p>
+    <w:p>
+      <w:pPr>
+        <w:numPr>
+          <w:ilvl w:val="0"/>
+          <w:numId w:val="13"/>
+        </w:numPr>
+      </w:pPr>
+      <w:r>
+        <w:rPr>
+          <w:b/>
+          <w:bCs/>
+        </w:rPr>
+        <w:t>Interactive Chatbot</w:t>
+      </w:r>
+      <w:r>
+        <w:t>:</w:t>
+      </w:r>
+    </w:p>
+    <w:p>
+      <w:pPr>
+        <w:numPr>
+          <w:ilvl w:val="1"/>
+          <w:numId w:val="13"/>
+        </w:numPr>
+      </w:pPr>
+      <w:r>
+        <w:rPr>
+          <w:b/>
+          <w:bCs/>
+        </w:rPr>
+        <w:t>Logic</w:t>
+      </w:r>
+      <w:r>
+        <w:t xml:space="preserve">: A "Narrative Oracle" that retrieves data from </w:t>
+      </w:r>
+      <w:proofErr w:type="spellStart"/>
+      <w:r>
+        <w:t>narrative_</w:t>
+      </w:r>
+      <w:proofErr w:type="gramStart"/>
+      <w:r>
+        <w:t>updates.json</w:t>
+      </w:r>
+      <w:proofErr w:type="spellEnd"/>
+      <w:proofErr w:type="gramEnd"/>
+      <w:r>
+        <w:t>.</w:t>
+      </w:r>
+    </w:p>
+    <w:p>
+      <w:pPr>
+        <w:numPr>
+          <w:ilvl w:val="1"/>
+          <w:numId w:val="13"/>
+        </w:numPr>
+      </w:pPr>
+      <w:r>
+        <w:rPr>
+          <w:b/>
+          <w:bCs/>
+        </w:rPr>
+        <w:t>Query Example</w:t>
+      </w:r>
+      <w:r>
+        <w:t xml:space="preserve">: User: </w:t>
+      </w:r>
+      <w:r>
+        <w:rPr>
+          <w:i/>
+          <w:iCs/>
+        </w:rPr>
+        <w:t>"What is the forecast?"</w:t>
+      </w:r>
+      <w:r>
+        <w:t xml:space="preserve"> Bot: </w:t>
+      </w:r>
+      <w:r>
+        <w:rPr>
+          <w:i/>
+          <w:iCs/>
+        </w:rPr>
+        <w:t>"The model predicts a 2.4% rise (MAPE: 0.12) due to a surge in 'Geopolitical Risk' (GPR) nodes."</w:t>
+      </w:r>
+    </w:p>
+    <w:p>
+      <w:pPr>
+        <w:numPr>
+          <w:ilvl w:val="0"/>
+          <w:numId w:val="13"/>
+        </w:numPr>
+      </w:pPr>
+      <w:r>
+        <w:rPr>
+          <w:b/>
+          <w:bCs/>
+        </w:rPr>
+        <w:t>Coefficient Formula Display</w:t>
+      </w:r>
+      <w:r>
+        <w:t>: A visual "Logic Card" showing the exact formula generated by the current training iteration.</w:t>
+      </w:r>
+    </w:p>
+    <w:p>
+      <w:r>
+        <w:lastRenderedPageBreak/>
+        <w:pict w14:anchorId="7D2DB0F8">
+          <v:rect id="_x0000_i1092" style="width:0;height:1.5pt" o:hralign="center" o:hrstd="t" o:hr="t" fillcolor="#a0a0a0" stroked="f"/>
+        </w:pict>
+      </w:r>
+    </w:p>
+    <w:p>
+      <w:pPr>
+        <w:rPr>
+          <w:b/>
+          <w:bCs/>
+        </w:rPr>
+      </w:pPr>
+      <w:r>
+        <w:rPr>
+          <w:b/>
+          <w:bCs/>
+        </w:rPr>
+        <w:t>Directory Roadmap for Model 3</w:t>
+      </w:r>
+    </w:p>
+    <w:p>
+      <w:r>
+        <w:t>Plaintext</w:t>
+      </w:r>
+    </w:p>
+    <w:p>
+      <w:r>
+        <w:t>/ROOT</w:t>
+      </w:r>
+    </w:p>
+    <w:p>
+      <w:r>
+        <w:rPr>
+          <w:rFonts w:ascii="MS Gothic" w:eastAsia="MS Gothic" w:hAnsi="MS Gothic" w:cs="MS Gothic" w:hint="eastAsia"/>
+        </w:rPr>
+        <w:t>├</w:t>
+      </w:r>
+      <w:r>
+        <w:rPr>
+          <w:rFonts w:ascii="Calibri" w:hAnsi="Calibri" w:cs="Calibri"/>
+        </w:rPr>
+        <w:t>──</w:t>
+      </w:r>
+      <w:r>
+        <w:t xml:space="preserve"> /brain (The Python Engine)</w:t>
+      </w:r>
+    </w:p>
+    <w:p>
+      <w:r>
+        <w:t xml:space="preserve">│   </w:t>
+      </w:r>
+      <w:r>
+        <w:rPr>
+          <w:rFonts w:ascii="MS Gothic" w:eastAsia="MS Gothic" w:hAnsi="MS Gothic" w:cs="MS Gothic" w:hint="eastAsia"/>
+        </w:rPr>
+        <w:t>├</w:t>
+      </w:r>
+      <w:r>
+        <w:rPr>
+          <w:rFonts w:ascii="Calibri" w:hAnsi="Calibri" w:cs="Calibri"/>
+        </w:rPr>
+        <w:t>──</w:t>
+      </w:r>
+      <w:r>
+        <w:t xml:space="preserve"> chronos_brain.py    # Structural Regression</w:t>
+      </w:r>
+    </w:p>
+    <w:p>
+      <w:r>
+        <w:t xml:space="preserve">│   </w:t>
+      </w:r>
+      <w:r>
+        <w:rPr>
+          <w:rFonts w:ascii="MS Gothic" w:eastAsia="MS Gothic" w:hAnsi="MS Gothic" w:cs="MS Gothic" w:hint="eastAsia"/>
+        </w:rPr>
+        <w:t>├</w:t>
+      </w:r>
+      <w:r>
+        <w:rPr>
+          <w:rFonts w:ascii="Calibri" w:hAnsi="Calibri" w:cs="Calibri"/>
+        </w:rPr>
+        <w:t>──</w:t>
+      </w:r>
+      <w:r>
+        <w:t xml:space="preserve"> temporal_lobe.py    # LSTM Momentum</w:t>
+      </w:r>
+    </w:p>
+    <w:p>
+      <w:r>
+        <w:t xml:space="preserve">│   </w:t>
+      </w:r>
+      <w:r>
+        <w:rPr>
+          <w:rFonts w:ascii="MS Gothic" w:eastAsia="MS Gothic" w:hAnsi="MS Gothic" w:cs="MS Gothic" w:hint="eastAsia"/>
+        </w:rPr>
+        <w:t>├</w:t>
+      </w:r>
+      <w:r>
+        <w:rPr>
+          <w:rFonts w:ascii="Calibri" w:hAnsi="Calibri" w:cs="Calibri"/>
+        </w:rPr>
+        <w:t>──</w:t>
+      </w:r>
+      <w:r>
+        <w:t xml:space="preserve"> narrative_lobe.py   # News &amp; Sentiment</w:t>
+      </w:r>
+    </w:p>
+    <w:p>
+      <w:r>
+        <w:t>│   └── orchestrator.py     # Automated GitHub Bridge</w:t>
+      </w:r>
+    </w:p>
+    <w:p>
+      <w:r>
+        <w:rPr>
+          <w:rFonts w:ascii="MS Gothic" w:eastAsia="MS Gothic" w:hAnsi="MS Gothic" w:cs="MS Gothic" w:hint="eastAsia"/>
+        </w:rPr>
+        <w:t>├</w:t>
+      </w:r>
+      <w:r>
+        <w:rPr>
+          <w:rFonts w:ascii="Calibri" w:hAnsi="Calibri" w:cs="Calibri"/>
+        </w:rPr>
+        <w:t>──</w:t>
+      </w:r>
+      <w:r>
+        <w:t xml:space="preserve"> /data (Local CSV Root)</w:t>
+      </w:r>
+    </w:p>
+    <w:p>
+      <w:r>
+        <w:t xml:space="preserve">│   </w:t>
+      </w:r>
+      <w:r>
+        <w:rPr>
+          <w:rFonts w:ascii="MS Gothic" w:eastAsia="MS Gothic" w:hAnsi="MS Gothic" w:cs="MS Gothic" w:hint="eastAsia"/>
+        </w:rPr>
+        <w:t>├</w:t>
+      </w:r>
+      <w:r>
+        <w:rPr>
+          <w:rFonts w:ascii="Calibri" w:hAnsi="Calibri" w:cs="Calibri"/>
+        </w:rPr>
+        <w:t>──</w:t>
+      </w:r>
+      <w:r>
+        <w:t xml:space="preserve"> LBMA-GOLD-2018-2026.csv</w:t>
+      </w:r>
+    </w:p>
+    <w:p>
+      <w:r>
+        <w:t xml:space="preserve">│   </w:t>
+      </w:r>
+      <w:r>
+        <w:rPr>
+          <w:rFonts w:ascii="MS Gothic" w:eastAsia="MS Gothic" w:hAnsi="MS Gothic" w:cs="MS Gothic" w:hint="eastAsia"/>
+        </w:rPr>
+        <w:t>├</w:t>
+      </w:r>
+      <w:r>
+        <w:rPr>
+          <w:rFonts w:ascii="Calibri" w:hAnsi="Calibri" w:cs="Calibri"/>
+        </w:rPr>
+        <w:t>──</w:t>
+      </w:r>
+      <w:r>
+        <w:t xml:space="preserve"> GLD-HOLDINGS.csv</w:t>
+      </w:r>
+    </w:p>
+    <w:p>
+      <w:r>
+        <w:t xml:space="preserve">│   </w:t>
+      </w:r>
+      <w:r>
+        <w:rPr>
+          <w:rFonts w:ascii="MS Gothic" w:eastAsia="MS Gothic" w:hAnsi="MS Gothic" w:cs="MS Gothic" w:hint="eastAsia"/>
+        </w:rPr>
+        <w:t>├</w:t>
+      </w:r>
+      <w:r>
+        <w:rPr>
+          <w:rFonts w:ascii="Calibri" w:hAnsi="Calibri" w:cs="Calibri"/>
+        </w:rPr>
+        <w:t>──</w:t>
+      </w:r>
+      <w:r>
+        <w:t xml:space="preserve"> EPU-INDEX.csv</w:t>
+      </w:r>
+    </w:p>
+    <w:p>
+      <w:r>
+        <w:t>│   └── GPR-INDEX.csv</w:t>
+      </w:r>
+    </w:p>
+    <w:p>
+      <w:r>
+        <w:rPr>
+          <w:rFonts w:ascii="MS Gothic" w:eastAsia="MS Gothic" w:hAnsi="MS Gothic" w:cs="MS Gothic" w:hint="eastAsia"/>
+        </w:rPr>
+        <w:t>├</w:t>
+      </w:r>
+      <w:r>
+        <w:rPr>
+          <w:rFonts w:ascii="Calibri" w:hAnsi="Calibri" w:cs="Calibri"/>
+        </w:rPr>
+        <w:t>──</w:t>
+      </w:r>
+      <w:r>
+        <w:t xml:space="preserve"> /</w:t>
+      </w:r>
+      <w:proofErr w:type="spellStart"/>
+      <w:r>
+        <w:t>src</w:t>
+      </w:r>
+      <w:proofErr w:type="spellEnd"/>
+    </w:p>
+    <w:p>
+      <w:r>
+        <w:t xml:space="preserve">│   </w:t>
+      </w:r>
+      <w:r>
+        <w:rPr>
+          <w:rFonts w:ascii="MS Gothic" w:eastAsia="MS Gothic" w:hAnsi="MS Gothic" w:cs="MS Gothic" w:hint="eastAsia"/>
+        </w:rPr>
+        <w:t>├</w:t>
+      </w:r>
+      <w:r>
+        <w:rPr>
+          <w:rFonts w:ascii="Calibri" w:hAnsi="Calibri" w:cs="Calibri"/>
+        </w:rPr>
+        <w:t>──</w:t>
+      </w:r>
+      <w:r>
+        <w:t xml:space="preserve"> /components/model-3</w:t>
+      </w:r>
+    </w:p>
+    <w:p>
+      <w:r>
+        <w:t xml:space="preserve">│   │   </w:t>
+      </w:r>
+      <w:r>
+        <w:rPr>
+          <w:rFonts w:ascii="MS Gothic" w:eastAsia="MS Gothic" w:hAnsi="MS Gothic" w:cs="MS Gothic" w:hint="eastAsia"/>
+        </w:rPr>
+        <w:t>├</w:t>
+      </w:r>
+      <w:r>
+        <w:rPr>
+          <w:rFonts w:ascii="Calibri" w:hAnsi="Calibri" w:cs="Calibri"/>
+        </w:rPr>
+        <w:t>──</w:t>
+      </w:r>
+      <w:r>
+        <w:t xml:space="preserve"> </w:t>
+      </w:r>
+      <w:proofErr w:type="spellStart"/>
+      <w:r>
+        <w:t>RecursiveClientView.tsx</w:t>
+      </w:r>
+      <w:proofErr w:type="spellEnd"/>
+    </w:p>
+    <w:p>
+      <w:r>
+        <w:t xml:space="preserve">│   │   </w:t>
+      </w:r>
+      <w:r>
+        <w:rPr>
+          <w:rFonts w:ascii="MS Gothic" w:eastAsia="MS Gothic" w:hAnsi="MS Gothic" w:cs="MS Gothic" w:hint="eastAsia"/>
+        </w:rPr>
+        <w:t>├</w:t>
+      </w:r>
+      <w:r>
+        <w:rPr>
+          <w:rFonts w:ascii="Calibri" w:hAnsi="Calibri" w:cs="Calibri"/>
+        </w:rPr>
+        <w:t>──</w:t>
+      </w:r>
+      <w:r>
+        <w:t xml:space="preserve"> </w:t>
+      </w:r>
+      <w:proofErr w:type="spellStart"/>
+      <w:r>
+        <w:t>RecursiveMatrixTable.tsx</w:t>
+      </w:r>
+      <w:proofErr w:type="spellEnd"/>
+    </w:p>
+    <w:p>
+      <w:r>
+        <w:t xml:space="preserve">│   │   </w:t>
+      </w:r>
+      <w:r>
+        <w:rPr>
+          <w:rFonts w:ascii="MS Gothic" w:eastAsia="MS Gothic" w:hAnsi="MS Gothic" w:cs="MS Gothic" w:hint="eastAsia"/>
+        </w:rPr>
+        <w:t>├</w:t>
+      </w:r>
+      <w:r>
+        <w:rPr>
+          <w:rFonts w:ascii="Calibri" w:hAnsi="Calibri" w:cs="Calibri"/>
+        </w:rPr>
+        <w:t>──</w:t>
+      </w:r>
+      <w:r>
+        <w:t xml:space="preserve"> </w:t>
+      </w:r>
+      <w:proofErr w:type="spellStart"/>
+      <w:r>
+        <w:t>FactorInfrastructureCard.tsx</w:t>
+      </w:r>
+      <w:proofErr w:type="spellEnd"/>
+    </w:p>
+    <w:p>
+      <w:r>
+        <w:t xml:space="preserve">│   │   └── </w:t>
+      </w:r>
+      <w:proofErr w:type="spellStart"/>
+      <w:r>
+        <w:t>RecursiveChatbot.tsx</w:t>
+      </w:r>
+      <w:proofErr w:type="spellEnd"/>
+      <w:r>
+        <w:t xml:space="preserve"> (New)</w:t>
+      </w:r>
+    </w:p>
+    <w:p>
+      <w:r>
+        <w:t>│   └── /lib/data/model-3</w:t>
+      </w:r>
+    </w:p>
+    <w:p>
+      <w:r>
+        <w:t xml:space="preserve">│       </w:t>
+      </w:r>
+      <w:r>
+        <w:rPr>
+          <w:rFonts w:ascii="MS Gothic" w:eastAsia="MS Gothic" w:hAnsi="MS Gothic" w:cs="MS Gothic" w:hint="eastAsia"/>
+        </w:rPr>
+        <w:t>├</w:t>
+      </w:r>
+      <w:r>
+        <w:rPr>
+          <w:rFonts w:ascii="Calibri" w:hAnsi="Calibri" w:cs="Calibri"/>
+        </w:rPr>
+        <w:t>──</w:t>
+      </w:r>
+      <w:r>
+        <w:t xml:space="preserve"> </w:t>
+      </w:r>
+      <w:proofErr w:type="spellStart"/>
+      <w:proofErr w:type="gramStart"/>
+      <w:r>
+        <w:t>forecast.json</w:t>
+      </w:r>
+      <w:proofErr w:type="spellEnd"/>
+      <w:proofErr w:type="gramEnd"/>
+      <w:r>
+        <w:t xml:space="preserve">    </w:t>
+      </w:r>
+      <w:proofErr w:type="gramStart"/>
+      <w:r>
+        <w:t xml:space="preserve">   (</w:t>
+      </w:r>
+      <w:proofErr w:type="gramEnd"/>
+      <w:r>
+        <w:t>Live Sync)</w:t>
+      </w:r>
+    </w:p>
+    <w:p>
+      <w:r>
+        <w:t xml:space="preserve">│       </w:t>
+      </w:r>
+      <w:r>
+        <w:rPr>
+          <w:rFonts w:ascii="MS Gothic" w:eastAsia="MS Gothic" w:hAnsi="MS Gothic" w:cs="MS Gothic" w:hint="eastAsia"/>
+        </w:rPr>
+        <w:t>├</w:t>
+      </w:r>
+      <w:r>
+        <w:rPr>
+          <w:rFonts w:ascii="Calibri" w:hAnsi="Calibri" w:cs="Calibri"/>
+        </w:rPr>
+        <w:t>──</w:t>
+      </w:r>
+      <w:r>
+        <w:t xml:space="preserve"> </w:t>
+      </w:r>
+      <w:proofErr w:type="spellStart"/>
+      <w:r>
+        <w:t>narrative_</w:t>
+      </w:r>
+      <w:proofErr w:type="gramStart"/>
+      <w:r>
+        <w:t>updates.json</w:t>
+      </w:r>
+      <w:proofErr w:type="spellEnd"/>
+      <w:proofErr w:type="gramEnd"/>
+      <w:r>
+        <w:t xml:space="preserve"> (Live Sync)</w:t>
+      </w:r>
+    </w:p>
+    <w:p>
+      <w:r>
+        <w:t xml:space="preserve">│       └── </w:t>
+      </w:r>
+      <w:proofErr w:type="spellStart"/>
+      <w:r>
+        <w:t>temporal_</w:t>
+      </w:r>
+      <w:proofErr w:type="gramStart"/>
+      <w:r>
+        <w:t>forecast.json</w:t>
+      </w:r>
+      <w:proofErr w:type="spellEnd"/>
+      <w:proofErr w:type="gramEnd"/>
+      <w:r>
+        <w:t xml:space="preserve">  (Live Sync)</w:t>
+      </w:r>
+    </w:p>
+    <w:p>
+      <w:pPr>
+        <w:rPr>
+          <w:b/>
+          <w:bCs/>
+        </w:rPr>
+      </w:pPr>
+      <w:r>
+        <w:rPr>
+          <w:b/>
+          <w:bCs/>
+        </w:rPr>
+        <w:t>The "Code Command" Protocol</w:t>
+      </w:r>
+    </w:p>
+    <w:p>
+      <w:r>
+        <w:lastRenderedPageBreak/>
+        <w:t xml:space="preserve">I have locked the </w:t>
+      </w:r>
+      <w:r>
+        <w:rPr>
+          <w:b/>
+          <w:bCs/>
+        </w:rPr>
+        <w:t>V15.2 Neural Nexus</w:t>
+      </w:r>
+      <w:r>
+        <w:t xml:space="preserve"> logic and the </w:t>
+      </w:r>
+      <w:r>
+        <w:rPr>
+          <w:b/>
+          <w:bCs/>
+        </w:rPr>
+        <w:t>Model 3 Next.js</w:t>
+      </w:r>
+      <w:r>
+        <w:t xml:space="preserve"> structure in memory. We are ready to begin the transition.</w:t>
+      </w:r>
+    </w:p>
+    <w:p>
+      <w:r>
+        <w:rPr>
+          <w:b/>
+          <w:bCs/>
+        </w:rPr>
+        <w:t>Step 1: Metric Injection.</w:t>
+      </w:r>
+      <w:r>
+        <w:t xml:space="preserve"> We must first prepare the Next.js </w:t>
+      </w:r>
+      <w:proofErr w:type="spellStart"/>
+      <w:r>
+        <w:t>maxHistoryEngine.ts</w:t>
+      </w:r>
+      <w:proofErr w:type="spellEnd"/>
+      <w:r>
+        <w:t xml:space="preserve"> to receive the new Accuracy Metrics from the Python Brain.</w:t>
+      </w:r>
+    </w:p>
+    <w:p>
+      <w:r>
+        <w:rPr>
+          <w:b/>
+          <w:bCs/>
+        </w:rPr>
+        <w:t xml:space="preserve">Would you like me to generate the code for the updated </w:t>
+      </w:r>
+      <w:proofErr w:type="spellStart"/>
+      <w:r>
+        <w:rPr>
+          <w:b/>
+          <w:bCs/>
+        </w:rPr>
+        <w:t>maxHistoryEngine.ts</w:t>
+      </w:r>
+      <w:proofErr w:type="spellEnd"/>
+      <w:r>
+        <w:rPr>
+          <w:b/>
+          <w:bCs/>
+        </w:rPr>
+        <w:t xml:space="preserve"> (with MAPE/RMSE/MAD support) now?</w:t>
+      </w:r>
+    </w:p>
     <w:p/>
+    <w:p>
+      <w:r>
+        <w:br w:type="page"/>
+      </w:r>
+    </w:p>
+    <w:p>
+      <w:r>
+        <w:lastRenderedPageBreak/>
+        <w:t xml:space="preserve">I have analyzed your </w:t>
+      </w:r>
+      <w:r>
+        <w:rPr>
+          <w:b/>
+          <w:bCs/>
+        </w:rPr>
+        <w:t>Omniscient Neural Nexus (V15.2)</w:t>
+      </w:r>
+      <w:r>
+        <w:t xml:space="preserve"> logic and the </w:t>
+      </w:r>
+      <w:r>
+        <w:rPr>
+          <w:b/>
+          <w:bCs/>
+        </w:rPr>
+        <w:t>BUSA 720</w:t>
+      </w:r>
+      <w:r>
+        <w:t xml:space="preserve"> syllabus requirements. To give you that "wow" factor, we are moving away from simple price display to a </w:t>
+      </w:r>
+      <w:r>
+        <w:rPr>
+          <w:b/>
+          <w:bCs/>
+        </w:rPr>
+        <w:t>Managerial Decision Interface</w:t>
+      </w:r>
+      <w:r>
+        <w:t>.</w:t>
+      </w:r>
+    </w:p>
+    <w:p>
+      <w:r>
+        <w:t xml:space="preserve">I have updated the </w:t>
+      </w:r>
+      <w:r>
+        <w:rPr>
+          <w:b/>
+          <w:bCs/>
+        </w:rPr>
+        <w:t>Recursive Client View</w:t>
+      </w:r>
+      <w:r>
+        <w:t xml:space="preserve"> to include the </w:t>
+      </w:r>
+      <w:r>
+        <w:rPr>
+          <w:b/>
+          <w:bCs/>
+        </w:rPr>
+        <w:t>Neural Nexus HUD (HUD 2)</w:t>
+      </w:r>
+      <w:r>
+        <w:t xml:space="preserve">. This new component specifically displays the </w:t>
+      </w:r>
+      <w:r>
+        <w:rPr>
+          <w:b/>
+          <w:bCs/>
+        </w:rPr>
+        <w:t>Regression Formula</w:t>
+      </w:r>
+      <w:r>
+        <w:t xml:space="preserve"> and the </w:t>
+      </w:r>
+      <w:r>
+        <w:rPr>
+          <w:b/>
+          <w:bCs/>
+        </w:rPr>
+        <w:t>BUSA Accuracy Metrics (MAPE/RMSE)</w:t>
+      </w:r>
+      <w:r>
+        <w:t xml:space="preserve"> exactly like the professional "Brain" page in your Model 2 images.</w:t>
+      </w:r>
+    </w:p>
+    <w:p/>
+    <w:p>
+      <w:r>
+        <w:t>/ROOT</w:t>
+      </w:r>
+    </w:p>
+    <w:p>
+      <w:r>
+        <w:rPr>
+          <w:rFonts w:ascii="MS Gothic" w:eastAsia="MS Gothic" w:hAnsi="MS Gothic" w:cs="MS Gothic" w:hint="eastAsia"/>
+        </w:rPr>
+        <w:t>├</w:t>
+      </w:r>
+      <w:r>
+        <w:rPr>
+          <w:rFonts w:ascii="Calibri" w:hAnsi="Calibri" w:cs="Calibri"/>
+        </w:rPr>
+        <w:t>──</w:t>
+      </w:r>
+      <w:r>
+        <w:t xml:space="preserve"> /brain (Kaggle Training Engine - Python)</w:t>
+      </w:r>
+    </w:p>
+    <w:p>
+      <w:r>
+        <w:t xml:space="preserve">│   </w:t>
+      </w:r>
+      <w:r>
+        <w:rPr>
+          <w:rFonts w:ascii="MS Gothic" w:eastAsia="MS Gothic" w:hAnsi="MS Gothic" w:cs="MS Gothic" w:hint="eastAsia"/>
+        </w:rPr>
+        <w:t>├</w:t>
+      </w:r>
+      <w:r>
+        <w:rPr>
+          <w:rFonts w:ascii="Calibri" w:hAnsi="Calibri" w:cs="Calibri"/>
+        </w:rPr>
+        <w:t>──</w:t>
+      </w:r>
+      <w:r>
+        <w:t xml:space="preserve"> chronos_brain.py    # Structural Regression (</w:t>
+      </w:r>
+      <w:proofErr w:type="spellStart"/>
+      <w:r>
+        <w:t>XGBoost</w:t>
+      </w:r>
+      <w:proofErr w:type="spellEnd"/>
+      <w:r>
+        <w:t>/</w:t>
+      </w:r>
+      <w:proofErr w:type="spellStart"/>
+      <w:r>
+        <w:t>CatBoost</w:t>
+      </w:r>
+      <w:proofErr w:type="spellEnd"/>
+      <w:r>
+        <w:t>)</w:t>
+      </w:r>
+    </w:p>
+    <w:p>
+      <w:r>
+        <w:t xml:space="preserve">│   </w:t>
+      </w:r>
+      <w:r>
+        <w:rPr>
+          <w:rFonts w:ascii="MS Gothic" w:eastAsia="MS Gothic" w:hAnsi="MS Gothic" w:cs="MS Gothic" w:hint="eastAsia"/>
+        </w:rPr>
+        <w:t>├</w:t>
+      </w:r>
+      <w:r>
+        <w:rPr>
+          <w:rFonts w:ascii="Calibri" w:hAnsi="Calibri" w:cs="Calibri"/>
+        </w:rPr>
+        <w:t>──</w:t>
+      </w:r>
+      <w:r>
+        <w:t xml:space="preserve"> temporal_lobe.py    # Sequential Momentum (Bi-LSTM + Attention)</w:t>
+      </w:r>
+    </w:p>
+    <w:p>
+      <w:r>
+        <w:t xml:space="preserve">│   </w:t>
+      </w:r>
+      <w:r>
+        <w:rPr>
+          <w:rFonts w:ascii="MS Gothic" w:eastAsia="MS Gothic" w:hAnsi="MS Gothic" w:cs="MS Gothic" w:hint="eastAsia"/>
+        </w:rPr>
+        <w:t>├</w:t>
+      </w:r>
+      <w:r>
+        <w:rPr>
+          <w:rFonts w:ascii="Calibri" w:hAnsi="Calibri" w:cs="Calibri"/>
+        </w:rPr>
+        <w:t>──</w:t>
+      </w:r>
+      <w:r>
+        <w:t xml:space="preserve"> narrative_lobe.py   # Qualitative Context (NLP Sentiment)</w:t>
+      </w:r>
+    </w:p>
+    <w:p>
+      <w:r>
+        <w:t>│   └── orchestrator.py     # Automated GitHub Cloud Bridge</w:t>
+      </w:r>
+    </w:p>
+    <w:p>
+      <w:r>
+        <w:rPr>
+          <w:rFonts w:ascii="MS Gothic" w:eastAsia="MS Gothic" w:hAnsi="MS Gothic" w:cs="MS Gothic" w:hint="eastAsia"/>
+        </w:rPr>
+        <w:t>├</w:t>
+      </w:r>
+      <w:r>
+        <w:rPr>
+          <w:rFonts w:ascii="Calibri" w:hAnsi="Calibri" w:cs="Calibri"/>
+        </w:rPr>
+        <w:t>──</w:t>
+      </w:r>
+      <w:r>
+        <w:t xml:space="preserve"> /data (Local CSV Root)</w:t>
+      </w:r>
+    </w:p>
+    <w:p>
+      <w:r>
+        <w:t xml:space="preserve">│   </w:t>
+      </w:r>
+      <w:r>
+        <w:rPr>
+          <w:rFonts w:ascii="MS Gothic" w:eastAsia="MS Gothic" w:hAnsi="MS Gothic" w:cs="MS Gothic" w:hint="eastAsia"/>
+        </w:rPr>
+        <w:t>├</w:t>
+      </w:r>
+      <w:r>
+        <w:rPr>
+          <w:rFonts w:ascii="Calibri" w:hAnsi="Calibri" w:cs="Calibri"/>
+        </w:rPr>
+        <w:t>──</w:t>
+      </w:r>
+      <w:r>
+        <w:t xml:space="preserve"> LBMA-GOLD-2018-2026.csv</w:t>
+      </w:r>
+    </w:p>
+    <w:p>
+      <w:r>
+        <w:t xml:space="preserve">│   </w:t>
+      </w:r>
+      <w:r>
+        <w:rPr>
+          <w:rFonts w:ascii="MS Gothic" w:eastAsia="MS Gothic" w:hAnsi="MS Gothic" w:cs="MS Gothic" w:hint="eastAsia"/>
+        </w:rPr>
+        <w:t>├</w:t>
+      </w:r>
+      <w:r>
+        <w:rPr>
+          <w:rFonts w:ascii="Calibri" w:hAnsi="Calibri" w:cs="Calibri"/>
+        </w:rPr>
+        <w:t>──</w:t>
+      </w:r>
+      <w:r>
+        <w:t xml:space="preserve"> GLD-HOLDINGS.csv</w:t>
+      </w:r>
+    </w:p>
+    <w:p>
+      <w:r>
+        <w:t xml:space="preserve">│   </w:t>
+      </w:r>
+      <w:r>
+        <w:rPr>
+          <w:rFonts w:ascii="MS Gothic" w:eastAsia="MS Gothic" w:hAnsi="MS Gothic" w:cs="MS Gothic" w:hint="eastAsia"/>
+        </w:rPr>
+        <w:t>├</w:t>
+      </w:r>
+      <w:r>
+        <w:rPr>
+          <w:rFonts w:ascii="Calibri" w:hAnsi="Calibri" w:cs="Calibri"/>
+        </w:rPr>
+        <w:t>──</w:t>
+      </w:r>
+      <w:r>
+        <w:t xml:space="preserve"> EPU-INDEX.csv</w:t>
+      </w:r>
+    </w:p>
+    <w:p>
+      <w:r>
+        <w:t>│   └── GPR-INDEX.csv</w:t>
+      </w:r>
+    </w:p>
+    <w:p>
+      <w:r>
+        <w:rPr>
+          <w:rFonts w:ascii="MS Gothic" w:eastAsia="MS Gothic" w:hAnsi="MS Gothic" w:cs="MS Gothic" w:hint="eastAsia"/>
+        </w:rPr>
+        <w:t>├</w:t>
+      </w:r>
+      <w:r>
+        <w:rPr>
+          <w:rFonts w:ascii="Calibri" w:hAnsi="Calibri" w:cs="Calibri"/>
+        </w:rPr>
+        <w:t>──</w:t>
+      </w:r>
+      <w:r>
+        <w:t xml:space="preserve"> /</w:t>
+      </w:r>
+      <w:proofErr w:type="spellStart"/>
+      <w:r>
+        <w:t>src</w:t>
+      </w:r>
+      <w:proofErr w:type="spellEnd"/>
+    </w:p>
+    <w:p>
+      <w:r>
+        <w:t xml:space="preserve">│   </w:t>
+      </w:r>
+      <w:r>
+        <w:rPr>
+          <w:rFonts w:ascii="MS Gothic" w:eastAsia="MS Gothic" w:hAnsi="MS Gothic" w:cs="MS Gothic" w:hint="eastAsia"/>
+        </w:rPr>
+        <w:t>├</w:t>
+      </w:r>
+      <w:r>
+        <w:rPr>
+          <w:rFonts w:ascii="Calibri" w:hAnsi="Calibri" w:cs="Calibri"/>
+        </w:rPr>
+        <w:t>──</w:t>
+      </w:r>
+      <w:r>
+        <w:t xml:space="preserve"> /components/model-3</w:t>
+      </w:r>
+    </w:p>
+    <w:p>
+      <w:r>
+        <w:t xml:space="preserve">│   │   </w:t>
+      </w:r>
+      <w:r>
+        <w:rPr>
+          <w:rFonts w:ascii="MS Gothic" w:eastAsia="MS Gothic" w:hAnsi="MS Gothic" w:cs="MS Gothic" w:hint="eastAsia"/>
+        </w:rPr>
+        <w:t>├</w:t>
+      </w:r>
+      <w:r>
+        <w:rPr>
+          <w:rFonts w:ascii="Calibri" w:hAnsi="Calibri" w:cs="Calibri"/>
+        </w:rPr>
+        <w:t>──</w:t>
+      </w:r>
+      <w:r>
+        <w:t xml:space="preserve"> </w:t>
+      </w:r>
+      <w:proofErr w:type="spellStart"/>
+      <w:r>
+        <w:t>RecursiveClientView.tsx</w:t>
+      </w:r>
+      <w:proofErr w:type="spellEnd"/>
+      <w:r>
+        <w:t xml:space="preserve">   # Master UI</w:t>
+      </w:r>
+    </w:p>
+    <w:p>
+      <w:r>
+        <w:t xml:space="preserve">│   │   </w:t>
+      </w:r>
+      <w:r>
+        <w:rPr>
+          <w:rFonts w:ascii="MS Gothic" w:eastAsia="MS Gothic" w:hAnsi="MS Gothic" w:cs="MS Gothic" w:hint="eastAsia"/>
+        </w:rPr>
+        <w:t>├</w:t>
+      </w:r>
+      <w:r>
+        <w:rPr>
+          <w:rFonts w:ascii="Calibri" w:hAnsi="Calibri" w:cs="Calibri"/>
+        </w:rPr>
+        <w:t>──</w:t>
+      </w:r>
+      <w:r>
+        <w:t xml:space="preserve"> </w:t>
+      </w:r>
+      <w:proofErr w:type="spellStart"/>
+      <w:r>
+        <w:t>NeuralNexusHUD.tsx</w:t>
+      </w:r>
+      <w:proofErr w:type="spellEnd"/>
+      <w:r>
+        <w:t xml:space="preserve">        # HUD 2: Accuracy &amp; Formula (NEW)</w:t>
+      </w:r>
+    </w:p>
+    <w:p>
+      <w:r>
+        <w:t xml:space="preserve">│   │   </w:t>
+      </w:r>
+      <w:r>
+        <w:rPr>
+          <w:rFonts w:ascii="MS Gothic" w:eastAsia="MS Gothic" w:hAnsi="MS Gothic" w:cs="MS Gothic" w:hint="eastAsia"/>
+        </w:rPr>
+        <w:t>├</w:t>
+      </w:r>
+      <w:r>
+        <w:rPr>
+          <w:rFonts w:ascii="Calibri" w:hAnsi="Calibri" w:cs="Calibri"/>
+        </w:rPr>
+        <w:t>──</w:t>
+      </w:r>
+      <w:r>
+        <w:t xml:space="preserve"> </w:t>
+      </w:r>
+      <w:proofErr w:type="spellStart"/>
+      <w:proofErr w:type="gramStart"/>
+      <w:r>
+        <w:t>RecursiveMatrixTable.tsx</w:t>
+      </w:r>
+      <w:proofErr w:type="spellEnd"/>
+      <w:r>
+        <w:t xml:space="preserve">  #</w:t>
+      </w:r>
+      <w:proofErr w:type="gramEnd"/>
+      <w:r>
+        <w:t xml:space="preserve"> Zero-Buffer Ledger</w:t>
+      </w:r>
+    </w:p>
+    <w:p>
+      <w:r>
+        <w:t xml:space="preserve">│   │   └── </w:t>
+      </w:r>
+      <w:proofErr w:type="spellStart"/>
+      <w:r>
+        <w:t>RecursiveChatbot.tsx</w:t>
+      </w:r>
+      <w:proofErr w:type="spellEnd"/>
+      <w:r>
+        <w:t xml:space="preserve">      # Interactive Oracle (UPCOMING)</w:t>
+      </w:r>
+    </w:p>
+    <w:p>
+      <w:r>
+        <w:t>│   └── /lib/data/model-3</w:t>
+      </w:r>
+    </w:p>
+    <w:p>
+      <w:r>
+        <w:t xml:space="preserve">│       </w:t>
+      </w:r>
+      <w:r>
+        <w:rPr>
+          <w:rFonts w:ascii="MS Gothic" w:eastAsia="MS Gothic" w:hAnsi="MS Gothic" w:cs="MS Gothic" w:hint="eastAsia"/>
+        </w:rPr>
+        <w:t>├</w:t>
+      </w:r>
+      <w:r>
+        <w:rPr>
+          <w:rFonts w:ascii="Calibri" w:hAnsi="Calibri" w:cs="Calibri"/>
+        </w:rPr>
+        <w:t>──</w:t>
+      </w:r>
+      <w:r>
+        <w:t xml:space="preserve"> </w:t>
+      </w:r>
+      <w:proofErr w:type="spellStart"/>
+      <w:proofErr w:type="gramStart"/>
+      <w:r>
+        <w:t>forecast.json</w:t>
+      </w:r>
+      <w:proofErr w:type="spellEnd"/>
+      <w:proofErr w:type="gramEnd"/>
+      <w:r>
+        <w:t xml:space="preserve">             # Brain Output: Metrics &amp; Coefficients</w:t>
+      </w:r>
+    </w:p>
+    <w:p>
+      <w:r>
+        <w:t xml:space="preserve">│       └── </w:t>
+      </w:r>
+      <w:proofErr w:type="spellStart"/>
+      <w:r>
+        <w:t>narrative_</w:t>
+      </w:r>
+      <w:proofErr w:type="gramStart"/>
+      <w:r>
+        <w:t>updates.json</w:t>
+      </w:r>
+      <w:proofErr w:type="spellEnd"/>
+      <w:proofErr w:type="gramEnd"/>
+      <w:r>
+        <w:t xml:space="preserve">    # Brain Output: News &amp; Sentiment</w:t>
+      </w:r>
+    </w:p>
     <w:sectPr>
       <w:pgSz w:w="12240" w:h="15840"/>
       <w:pgMar w:top="1440" w:right="1440" w:bottom="1440" w:left="1440" w:header="708" w:footer="708" w:gutter="0"/>
@@ -1950,6 +3991,570 @@
     </w:lvl>
   </w:abstractNum>
   <w:abstractNum w:abstractNumId="3" w15:restartNumberingAfterBreak="0">
+    <w:nsid w:val="323008EA"/>
+    <w:multiLevelType w:val="multilevel"/>
+    <w:tmpl w:val="3E62B5E2"/>
+    <w:lvl w:ilvl="0">
+      <w:start w:val="1"/>
+      <w:numFmt w:val="bullet"/>
+      <w:lvlText w:val=""/>
+      <w:lvlJc w:val="left"/>
+      <w:pPr>
+        <w:tabs>
+          <w:tab w:val="num" w:pos="720"/>
+        </w:tabs>
+        <w:ind w:left="720" w:hanging="360"/>
+      </w:pPr>
+      <w:rPr>
+        <w:rFonts w:ascii="Symbol" w:hAnsi="Symbol" w:hint="default"/>
+        <w:sz w:val="20"/>
+      </w:rPr>
+    </w:lvl>
+    <w:lvl w:ilvl="1">
+      <w:start w:val="1"/>
+      <w:numFmt w:val="bullet"/>
+      <w:lvlText w:val="o"/>
+      <w:lvlJc w:val="left"/>
+      <w:pPr>
+        <w:tabs>
+          <w:tab w:val="num" w:pos="1440"/>
+        </w:tabs>
+        <w:ind w:left="1440" w:hanging="360"/>
+      </w:pPr>
+      <w:rPr>
+        <w:rFonts w:ascii="Courier New" w:hAnsi="Courier New" w:hint="default"/>
+        <w:sz w:val="20"/>
+      </w:rPr>
+    </w:lvl>
+    <w:lvl w:ilvl="2" w:tentative="1">
+      <w:start w:val="1"/>
+      <w:numFmt w:val="bullet"/>
+      <w:lvlText w:val=""/>
+      <w:lvlJc w:val="left"/>
+      <w:pPr>
+        <w:tabs>
+          <w:tab w:val="num" w:pos="2160"/>
+        </w:tabs>
+        <w:ind w:left="2160" w:hanging="360"/>
+      </w:pPr>
+      <w:rPr>
+        <w:rFonts w:ascii="Wingdings" w:hAnsi="Wingdings" w:hint="default"/>
+        <w:sz w:val="20"/>
+      </w:rPr>
+    </w:lvl>
+    <w:lvl w:ilvl="3" w:tentative="1">
+      <w:start w:val="1"/>
+      <w:numFmt w:val="bullet"/>
+      <w:lvlText w:val=""/>
+      <w:lvlJc w:val="left"/>
+      <w:pPr>
+        <w:tabs>
+          <w:tab w:val="num" w:pos="2880"/>
+        </w:tabs>
+        <w:ind w:left="2880" w:hanging="360"/>
+      </w:pPr>
+      <w:rPr>
+        <w:rFonts w:ascii="Wingdings" w:hAnsi="Wingdings" w:hint="default"/>
+        <w:sz w:val="20"/>
+      </w:rPr>
+    </w:lvl>
+    <w:lvl w:ilvl="4" w:tentative="1">
+      <w:start w:val="1"/>
+      <w:numFmt w:val="bullet"/>
+      <w:lvlText w:val=""/>
+      <w:lvlJc w:val="left"/>
+      <w:pPr>
+        <w:tabs>
+          <w:tab w:val="num" w:pos="3600"/>
+        </w:tabs>
+        <w:ind w:left="3600" w:hanging="360"/>
+      </w:pPr>
+      <w:rPr>
+        <w:rFonts w:ascii="Wingdings" w:hAnsi="Wingdings" w:hint="default"/>
+        <w:sz w:val="20"/>
+      </w:rPr>
+    </w:lvl>
+    <w:lvl w:ilvl="5" w:tentative="1">
+      <w:start w:val="1"/>
+      <w:numFmt w:val="bullet"/>
+      <w:lvlText w:val=""/>
+      <w:lvlJc w:val="left"/>
+      <w:pPr>
+        <w:tabs>
+          <w:tab w:val="num" w:pos="4320"/>
+        </w:tabs>
+        <w:ind w:left="4320" w:hanging="360"/>
+      </w:pPr>
+      <w:rPr>
+        <w:rFonts w:ascii="Wingdings" w:hAnsi="Wingdings" w:hint="default"/>
+        <w:sz w:val="20"/>
+      </w:rPr>
+    </w:lvl>
+    <w:lvl w:ilvl="6" w:tentative="1">
+      <w:start w:val="1"/>
+      <w:numFmt w:val="bullet"/>
+      <w:lvlText w:val=""/>
+      <w:lvlJc w:val="left"/>
+      <w:pPr>
+        <w:tabs>
+          <w:tab w:val="num" w:pos="5040"/>
+        </w:tabs>
+        <w:ind w:left="5040" w:hanging="360"/>
+      </w:pPr>
+      <w:rPr>
+        <w:rFonts w:ascii="Wingdings" w:hAnsi="Wingdings" w:hint="default"/>
+        <w:sz w:val="20"/>
+      </w:rPr>
+    </w:lvl>
+    <w:lvl w:ilvl="7" w:tentative="1">
+      <w:start w:val="1"/>
+      <w:numFmt w:val="bullet"/>
+      <w:lvlText w:val=""/>
+      <w:lvlJc w:val="left"/>
+      <w:pPr>
+        <w:tabs>
+          <w:tab w:val="num" w:pos="5760"/>
+        </w:tabs>
+        <w:ind w:left="5760" w:hanging="360"/>
+      </w:pPr>
+      <w:rPr>
+        <w:rFonts w:ascii="Wingdings" w:hAnsi="Wingdings" w:hint="default"/>
+        <w:sz w:val="20"/>
+      </w:rPr>
+    </w:lvl>
+    <w:lvl w:ilvl="8" w:tentative="1">
+      <w:start w:val="1"/>
+      <w:numFmt w:val="bullet"/>
+      <w:lvlText w:val=""/>
+      <w:lvlJc w:val="left"/>
+      <w:pPr>
+        <w:tabs>
+          <w:tab w:val="num" w:pos="6480"/>
+        </w:tabs>
+        <w:ind w:left="6480" w:hanging="360"/>
+      </w:pPr>
+      <w:rPr>
+        <w:rFonts w:ascii="Wingdings" w:hAnsi="Wingdings" w:hint="default"/>
+        <w:sz w:val="20"/>
+      </w:rPr>
+    </w:lvl>
+  </w:abstractNum>
+  <w:abstractNum w:abstractNumId="4" w15:restartNumberingAfterBreak="0">
+    <w:nsid w:val="404675C2"/>
+    <w:multiLevelType w:val="multilevel"/>
+    <w:tmpl w:val="ADAA02CE"/>
+    <w:lvl w:ilvl="0">
+      <w:start w:val="1"/>
+      <w:numFmt w:val="bullet"/>
+      <w:lvlText w:val=""/>
+      <w:lvlJc w:val="left"/>
+      <w:pPr>
+        <w:tabs>
+          <w:tab w:val="num" w:pos="720"/>
+        </w:tabs>
+        <w:ind w:left="720" w:hanging="360"/>
+      </w:pPr>
+      <w:rPr>
+        <w:rFonts w:ascii="Symbol" w:hAnsi="Symbol" w:hint="default"/>
+        <w:sz w:val="20"/>
+      </w:rPr>
+    </w:lvl>
+    <w:lvl w:ilvl="1">
+      <w:start w:val="1"/>
+      <w:numFmt w:val="bullet"/>
+      <w:lvlText w:val="o"/>
+      <w:lvlJc w:val="left"/>
+      <w:pPr>
+        <w:tabs>
+          <w:tab w:val="num" w:pos="1440"/>
+        </w:tabs>
+        <w:ind w:left="1440" w:hanging="360"/>
+      </w:pPr>
+      <w:rPr>
+        <w:rFonts w:ascii="Courier New" w:hAnsi="Courier New" w:hint="default"/>
+        <w:sz w:val="20"/>
+      </w:rPr>
+    </w:lvl>
+    <w:lvl w:ilvl="2" w:tentative="1">
+      <w:start w:val="1"/>
+      <w:numFmt w:val="bullet"/>
+      <w:lvlText w:val=""/>
+      <w:lvlJc w:val="left"/>
+      <w:pPr>
+        <w:tabs>
+          <w:tab w:val="num" w:pos="2160"/>
+        </w:tabs>
+        <w:ind w:left="2160" w:hanging="360"/>
+      </w:pPr>
+      <w:rPr>
+        <w:rFonts w:ascii="Wingdings" w:hAnsi="Wingdings" w:hint="default"/>
+        <w:sz w:val="20"/>
+      </w:rPr>
+    </w:lvl>
+    <w:lvl w:ilvl="3" w:tentative="1">
+      <w:start w:val="1"/>
+      <w:numFmt w:val="bullet"/>
+      <w:lvlText w:val=""/>
+      <w:lvlJc w:val="left"/>
+      <w:pPr>
+        <w:tabs>
+          <w:tab w:val="num" w:pos="2880"/>
+        </w:tabs>
+        <w:ind w:left="2880" w:hanging="360"/>
+      </w:pPr>
+      <w:rPr>
+        <w:rFonts w:ascii="Wingdings" w:hAnsi="Wingdings" w:hint="default"/>
+        <w:sz w:val="20"/>
+      </w:rPr>
+    </w:lvl>
+    <w:lvl w:ilvl="4" w:tentative="1">
+      <w:start w:val="1"/>
+      <w:numFmt w:val="bullet"/>
+      <w:lvlText w:val=""/>
+      <w:lvlJc w:val="left"/>
+      <w:pPr>
+        <w:tabs>
+          <w:tab w:val="num" w:pos="3600"/>
+        </w:tabs>
+        <w:ind w:left="3600" w:hanging="360"/>
+      </w:pPr>
+      <w:rPr>
+        <w:rFonts w:ascii="Wingdings" w:hAnsi="Wingdings" w:hint="default"/>
+        <w:sz w:val="20"/>
+      </w:rPr>
+    </w:lvl>
+    <w:lvl w:ilvl="5" w:tentative="1">
+      <w:start w:val="1"/>
+      <w:numFmt w:val="bullet"/>
+      <w:lvlText w:val=""/>
+      <w:lvlJc w:val="left"/>
+      <w:pPr>
+        <w:tabs>
+          <w:tab w:val="num" w:pos="4320"/>
+        </w:tabs>
+        <w:ind w:left="4320" w:hanging="360"/>
+      </w:pPr>
+      <w:rPr>
+        <w:rFonts w:ascii="Wingdings" w:hAnsi="Wingdings" w:hint="default"/>
+        <w:sz w:val="20"/>
+      </w:rPr>
+    </w:lvl>
+    <w:lvl w:ilvl="6" w:tentative="1">
+      <w:start w:val="1"/>
+      <w:numFmt w:val="bullet"/>
+      <w:lvlText w:val=""/>
+      <w:lvlJc w:val="left"/>
+      <w:pPr>
+        <w:tabs>
+          <w:tab w:val="num" w:pos="5040"/>
+        </w:tabs>
+        <w:ind w:left="5040" w:hanging="360"/>
+      </w:pPr>
+      <w:rPr>
+        <w:rFonts w:ascii="Wingdings" w:hAnsi="Wingdings" w:hint="default"/>
+        <w:sz w:val="20"/>
+      </w:rPr>
+    </w:lvl>
+    <w:lvl w:ilvl="7" w:tentative="1">
+      <w:start w:val="1"/>
+      <w:numFmt w:val="bullet"/>
+      <w:lvlText w:val=""/>
+      <w:lvlJc w:val="left"/>
+      <w:pPr>
+        <w:tabs>
+          <w:tab w:val="num" w:pos="5760"/>
+        </w:tabs>
+        <w:ind w:left="5760" w:hanging="360"/>
+      </w:pPr>
+      <w:rPr>
+        <w:rFonts w:ascii="Wingdings" w:hAnsi="Wingdings" w:hint="default"/>
+        <w:sz w:val="20"/>
+      </w:rPr>
+    </w:lvl>
+    <w:lvl w:ilvl="8" w:tentative="1">
+      <w:start w:val="1"/>
+      <w:numFmt w:val="bullet"/>
+      <w:lvlText w:val=""/>
+      <w:lvlJc w:val="left"/>
+      <w:pPr>
+        <w:tabs>
+          <w:tab w:val="num" w:pos="6480"/>
+        </w:tabs>
+        <w:ind w:left="6480" w:hanging="360"/>
+      </w:pPr>
+      <w:rPr>
+        <w:rFonts w:ascii="Wingdings" w:hAnsi="Wingdings" w:hint="default"/>
+        <w:sz w:val="20"/>
+      </w:rPr>
+    </w:lvl>
+  </w:abstractNum>
+  <w:abstractNum w:abstractNumId="5" w15:restartNumberingAfterBreak="0">
+    <w:nsid w:val="45A3399B"/>
+    <w:multiLevelType w:val="multilevel"/>
+    <w:tmpl w:val="6950BD64"/>
+    <w:lvl w:ilvl="0">
+      <w:start w:val="1"/>
+      <w:numFmt w:val="bullet"/>
+      <w:lvlText w:val=""/>
+      <w:lvlJc w:val="left"/>
+      <w:pPr>
+        <w:tabs>
+          <w:tab w:val="num" w:pos="720"/>
+        </w:tabs>
+        <w:ind w:left="720" w:hanging="360"/>
+      </w:pPr>
+      <w:rPr>
+        <w:rFonts w:ascii="Symbol" w:hAnsi="Symbol" w:hint="default"/>
+        <w:sz w:val="20"/>
+      </w:rPr>
+    </w:lvl>
+    <w:lvl w:ilvl="1">
+      <w:start w:val="1"/>
+      <w:numFmt w:val="bullet"/>
+      <w:lvlText w:val="o"/>
+      <w:lvlJc w:val="left"/>
+      <w:pPr>
+        <w:tabs>
+          <w:tab w:val="num" w:pos="1440"/>
+        </w:tabs>
+        <w:ind w:left="1440" w:hanging="360"/>
+      </w:pPr>
+      <w:rPr>
+        <w:rFonts w:ascii="Courier New" w:hAnsi="Courier New" w:hint="default"/>
+        <w:sz w:val="20"/>
+      </w:rPr>
+    </w:lvl>
+    <w:lvl w:ilvl="2" w:tentative="1">
+      <w:start w:val="1"/>
+      <w:numFmt w:val="bullet"/>
+      <w:lvlText w:val=""/>
+      <w:lvlJc w:val="left"/>
+      <w:pPr>
+        <w:tabs>
+          <w:tab w:val="num" w:pos="2160"/>
+        </w:tabs>
+        <w:ind w:left="2160" w:hanging="360"/>
+      </w:pPr>
+      <w:rPr>
+        <w:rFonts w:ascii="Wingdings" w:hAnsi="Wingdings" w:hint="default"/>
+        <w:sz w:val="20"/>
+      </w:rPr>
+    </w:lvl>
+    <w:lvl w:ilvl="3" w:tentative="1">
+      <w:start w:val="1"/>
+      <w:numFmt w:val="bullet"/>
+      <w:lvlText w:val=""/>
+      <w:lvlJc w:val="left"/>
+      <w:pPr>
+        <w:tabs>
+          <w:tab w:val="num" w:pos="2880"/>
+        </w:tabs>
+        <w:ind w:left="2880" w:hanging="360"/>
+      </w:pPr>
+      <w:rPr>
+        <w:rFonts w:ascii="Wingdings" w:hAnsi="Wingdings" w:hint="default"/>
+        <w:sz w:val="20"/>
+      </w:rPr>
+    </w:lvl>
+    <w:lvl w:ilvl="4" w:tentative="1">
+      <w:start w:val="1"/>
+      <w:numFmt w:val="bullet"/>
+      <w:lvlText w:val=""/>
+      <w:lvlJc w:val="left"/>
+      <w:pPr>
+        <w:tabs>
+          <w:tab w:val="num" w:pos="3600"/>
+        </w:tabs>
+        <w:ind w:left="3600" w:hanging="360"/>
+      </w:pPr>
+      <w:rPr>
+        <w:rFonts w:ascii="Wingdings" w:hAnsi="Wingdings" w:hint="default"/>
+        <w:sz w:val="20"/>
+      </w:rPr>
+    </w:lvl>
+    <w:lvl w:ilvl="5" w:tentative="1">
+      <w:start w:val="1"/>
+      <w:numFmt w:val="bullet"/>
+      <w:lvlText w:val=""/>
+      <w:lvlJc w:val="left"/>
+      <w:pPr>
+        <w:tabs>
+          <w:tab w:val="num" w:pos="4320"/>
+        </w:tabs>
+        <w:ind w:left="4320" w:hanging="360"/>
+      </w:pPr>
+      <w:rPr>
+        <w:rFonts w:ascii="Wingdings" w:hAnsi="Wingdings" w:hint="default"/>
+        <w:sz w:val="20"/>
+      </w:rPr>
+    </w:lvl>
+    <w:lvl w:ilvl="6" w:tentative="1">
+      <w:start w:val="1"/>
+      <w:numFmt w:val="bullet"/>
+      <w:lvlText w:val=""/>
+      <w:lvlJc w:val="left"/>
+      <w:pPr>
+        <w:tabs>
+          <w:tab w:val="num" w:pos="5040"/>
+        </w:tabs>
+        <w:ind w:left="5040" w:hanging="360"/>
+      </w:pPr>
+      <w:rPr>
+        <w:rFonts w:ascii="Wingdings" w:hAnsi="Wingdings" w:hint="default"/>
+        <w:sz w:val="20"/>
+      </w:rPr>
+    </w:lvl>
+    <w:lvl w:ilvl="7" w:tentative="1">
+      <w:start w:val="1"/>
+      <w:numFmt w:val="bullet"/>
+      <w:lvlText w:val=""/>
+      <w:lvlJc w:val="left"/>
+      <w:pPr>
+        <w:tabs>
+          <w:tab w:val="num" w:pos="5760"/>
+        </w:tabs>
+        <w:ind w:left="5760" w:hanging="360"/>
+      </w:pPr>
+      <w:rPr>
+        <w:rFonts w:ascii="Wingdings" w:hAnsi="Wingdings" w:hint="default"/>
+        <w:sz w:val="20"/>
+      </w:rPr>
+    </w:lvl>
+    <w:lvl w:ilvl="8" w:tentative="1">
+      <w:start w:val="1"/>
+      <w:numFmt w:val="bullet"/>
+      <w:lvlText w:val=""/>
+      <w:lvlJc w:val="left"/>
+      <w:pPr>
+        <w:tabs>
+          <w:tab w:val="num" w:pos="6480"/>
+        </w:tabs>
+        <w:ind w:left="6480" w:hanging="360"/>
+      </w:pPr>
+      <w:rPr>
+        <w:rFonts w:ascii="Wingdings" w:hAnsi="Wingdings" w:hint="default"/>
+        <w:sz w:val="20"/>
+      </w:rPr>
+    </w:lvl>
+  </w:abstractNum>
+  <w:abstractNum w:abstractNumId="6" w15:restartNumberingAfterBreak="0">
+    <w:nsid w:val="55A305CE"/>
+    <w:multiLevelType w:val="multilevel"/>
+    <w:tmpl w:val="AF2CD794"/>
+    <w:lvl w:ilvl="0">
+      <w:start w:val="1"/>
+      <w:numFmt w:val="decimal"/>
+      <w:lvlText w:val="%1."/>
+      <w:lvlJc w:val="left"/>
+      <w:pPr>
+        <w:tabs>
+          <w:tab w:val="num" w:pos="720"/>
+        </w:tabs>
+        <w:ind w:left="720" w:hanging="360"/>
+      </w:pPr>
+    </w:lvl>
+    <w:lvl w:ilvl="1">
+      <w:start w:val="1"/>
+      <w:numFmt w:val="bullet"/>
+      <w:lvlText w:val="o"/>
+      <w:lvlJc w:val="left"/>
+      <w:pPr>
+        <w:tabs>
+          <w:tab w:val="num" w:pos="1440"/>
+        </w:tabs>
+        <w:ind w:left="1440" w:hanging="360"/>
+      </w:pPr>
+      <w:rPr>
+        <w:rFonts w:ascii="Courier New" w:hAnsi="Courier New" w:hint="default"/>
+        <w:sz w:val="20"/>
+      </w:rPr>
+    </w:lvl>
+    <w:lvl w:ilvl="2" w:tentative="1">
+      <w:start w:val="1"/>
+      <w:numFmt w:val="decimal"/>
+      <w:lvlText w:val="%3."/>
+      <w:lvlJc w:val="left"/>
+      <w:pPr>
+        <w:tabs>
+          <w:tab w:val="num" w:pos="2160"/>
+        </w:tabs>
+        <w:ind w:left="2160" w:hanging="360"/>
+      </w:pPr>
+    </w:lvl>
+    <w:lvl w:ilvl="3" w:tentative="1">
+      <w:start w:val="1"/>
+      <w:numFmt w:val="decimal"/>
+      <w:lvlText w:val="%4."/>
+      <w:lvlJc w:val="left"/>
+      <w:pPr>
+        <w:tabs>
+          <w:tab w:val="num" w:pos="2880"/>
+        </w:tabs>
+        <w:ind w:left="2880" w:hanging="360"/>
+      </w:pPr>
+    </w:lvl>
+    <w:lvl w:ilvl="4" w:tentative="1">
+      <w:start w:val="1"/>
+      <w:numFmt w:val="decimal"/>
+      <w:lvlText w:val="%5."/>
+      <w:lvlJc w:val="left"/>
+      <w:pPr>
+        <w:tabs>
+          <w:tab w:val="num" w:pos="3600"/>
+        </w:tabs>
+        <w:ind w:left="3600" w:hanging="360"/>
+      </w:pPr>
+    </w:lvl>
+    <w:lvl w:ilvl="5" w:tentative="1">
+      <w:start w:val="1"/>
+      <w:numFmt w:val="decimal"/>
+      <w:lvlText w:val="%6."/>
+      <w:lvlJc w:val="left"/>
+      <w:pPr>
+        <w:tabs>
+          <w:tab w:val="num" w:pos="4320"/>
+        </w:tabs>
+        <w:ind w:left="4320" w:hanging="360"/>
+      </w:pPr>
+    </w:lvl>
+    <w:lvl w:ilvl="6" w:tentative="1">
+      <w:start w:val="1"/>
+      <w:numFmt w:val="decimal"/>
+      <w:lvlText w:val="%7."/>
+      <w:lvlJc w:val="left"/>
+      <w:pPr>
+        <w:tabs>
+          <w:tab w:val="num" w:pos="5040"/>
+        </w:tabs>
+        <w:ind w:left="5040" w:hanging="360"/>
+      </w:pPr>
+    </w:lvl>
+    <w:lvl w:ilvl="7" w:tentative="1">
+      <w:start w:val="1"/>
+      <w:numFmt w:val="decimal"/>
+      <w:lvlText w:val="%8."/>
+      <w:lvlJc w:val="left"/>
+      <w:pPr>
+        <w:tabs>
+          <w:tab w:val="num" w:pos="5760"/>
+        </w:tabs>
+        <w:ind w:left="5760" w:hanging="360"/>
+      </w:pPr>
+    </w:lvl>
+    <w:lvl w:ilvl="8" w:tentative="1">
+      <w:start w:val="1"/>
+      <w:numFmt w:val="decimal"/>
+      <w:lvlText w:val="%9."/>
+      <w:lvlJc w:val="left"/>
+      <w:pPr>
+        <w:tabs>
+          <w:tab w:val="num" w:pos="6480"/>
+        </w:tabs>
+        <w:ind w:left="6480" w:hanging="360"/>
+      </w:pPr>
+    </w:lvl>
+  </w:abstractNum>
+  <w:abstractNum w:abstractNumId="7" w15:restartNumberingAfterBreak="0">
     <w:nsid w:val="6B6B29CF"/>
     <w:multiLevelType w:val="multilevel"/>
     <w:tmpl w:val="51382362"/>
@@ -2062,7 +4667,7 @@
       </w:pPr>
     </w:lvl>
   </w:abstractNum>
-  <w:abstractNum w:abstractNumId="4" w15:restartNumberingAfterBreak="0">
+  <w:abstractNum w:abstractNumId="8" w15:restartNumberingAfterBreak="0">
     <w:nsid w:val="6FF67212"/>
     <w:multiLevelType w:val="multilevel"/>
     <w:tmpl w:val="DA28EB92"/>
@@ -2211,7 +4816,7 @@
       </w:rPr>
     </w:lvl>
   </w:abstractNum>
-  <w:abstractNum w:abstractNumId="5" w15:restartNumberingAfterBreak="0">
+  <w:abstractNum w:abstractNumId="9" w15:restartNumberingAfterBreak="0">
     <w:nsid w:val="73710DF7"/>
     <w:multiLevelType w:val="multilevel"/>
     <w:tmpl w:val="E1726652"/>
@@ -2360,7 +4965,156 @@
       </w:rPr>
     </w:lvl>
   </w:abstractNum>
-  <w:abstractNum w:abstractNumId="6" w15:restartNumberingAfterBreak="0">
+  <w:abstractNum w:abstractNumId="10" w15:restartNumberingAfterBreak="0">
+    <w:nsid w:val="76EF0422"/>
+    <w:multiLevelType w:val="multilevel"/>
+    <w:tmpl w:val="635EA592"/>
+    <w:lvl w:ilvl="0">
+      <w:start w:val="1"/>
+      <w:numFmt w:val="bullet"/>
+      <w:lvlText w:val=""/>
+      <w:lvlJc w:val="left"/>
+      <w:pPr>
+        <w:tabs>
+          <w:tab w:val="num" w:pos="720"/>
+        </w:tabs>
+        <w:ind w:left="720" w:hanging="360"/>
+      </w:pPr>
+      <w:rPr>
+        <w:rFonts w:ascii="Symbol" w:hAnsi="Symbol" w:hint="default"/>
+        <w:sz w:val="20"/>
+      </w:rPr>
+    </w:lvl>
+    <w:lvl w:ilvl="1">
+      <w:start w:val="1"/>
+      <w:numFmt w:val="bullet"/>
+      <w:lvlText w:val="o"/>
+      <w:lvlJc w:val="left"/>
+      <w:pPr>
+        <w:tabs>
+          <w:tab w:val="num" w:pos="1440"/>
+        </w:tabs>
+        <w:ind w:left="1440" w:hanging="360"/>
+      </w:pPr>
+      <w:rPr>
+        <w:rFonts w:ascii="Courier New" w:hAnsi="Courier New" w:hint="default"/>
+        <w:sz w:val="20"/>
+      </w:rPr>
+    </w:lvl>
+    <w:lvl w:ilvl="2" w:tentative="1">
+      <w:start w:val="1"/>
+      <w:numFmt w:val="bullet"/>
+      <w:lvlText w:val=""/>
+      <w:lvlJc w:val="left"/>
+      <w:pPr>
+        <w:tabs>
+          <w:tab w:val="num" w:pos="2160"/>
+        </w:tabs>
+        <w:ind w:left="2160" w:hanging="360"/>
+      </w:pPr>
+      <w:rPr>
+        <w:rFonts w:ascii="Wingdings" w:hAnsi="Wingdings" w:hint="default"/>
+        <w:sz w:val="20"/>
+      </w:rPr>
+    </w:lvl>
+    <w:lvl w:ilvl="3" w:tentative="1">
+      <w:start w:val="1"/>
+      <w:numFmt w:val="bullet"/>
+      <w:lvlText w:val=""/>
+      <w:lvlJc w:val="left"/>
+      <w:pPr>
+        <w:tabs>
+          <w:tab w:val="num" w:pos="2880"/>
+        </w:tabs>
+        <w:ind w:left="2880" w:hanging="360"/>
+      </w:pPr>
+      <w:rPr>
+        <w:rFonts w:ascii="Wingdings" w:hAnsi="Wingdings" w:hint="default"/>
+        <w:sz w:val="20"/>
+      </w:rPr>
+    </w:lvl>
+    <w:lvl w:ilvl="4" w:tentative="1">
+      <w:start w:val="1"/>
+      <w:numFmt w:val="bullet"/>
+      <w:lvlText w:val=""/>
+      <w:lvlJc w:val="left"/>
+      <w:pPr>
+        <w:tabs>
+          <w:tab w:val="num" w:pos="3600"/>
+        </w:tabs>
+        <w:ind w:left="3600" w:hanging="360"/>
+      </w:pPr>
+      <w:rPr>
+        <w:rFonts w:ascii="Wingdings" w:hAnsi="Wingdings" w:hint="default"/>
+        <w:sz w:val="20"/>
+      </w:rPr>
+    </w:lvl>
+    <w:lvl w:ilvl="5" w:tentative="1">
+      <w:start w:val="1"/>
+      <w:numFmt w:val="bullet"/>
+      <w:lvlText w:val=""/>
+      <w:lvlJc w:val="left"/>
+      <w:pPr>
+        <w:tabs>
+          <w:tab w:val="num" w:pos="4320"/>
+        </w:tabs>
+        <w:ind w:left="4320" w:hanging="360"/>
+      </w:pPr>
+      <w:rPr>
+        <w:rFonts w:ascii="Wingdings" w:hAnsi="Wingdings" w:hint="default"/>
+        <w:sz w:val="20"/>
+      </w:rPr>
+    </w:lvl>
+    <w:lvl w:ilvl="6" w:tentative="1">
+      <w:start w:val="1"/>
+      <w:numFmt w:val="bullet"/>
+      <w:lvlText w:val=""/>
+      <w:lvlJc w:val="left"/>
+      <w:pPr>
+        <w:tabs>
+          <w:tab w:val="num" w:pos="5040"/>
+        </w:tabs>
+        <w:ind w:left="5040" w:hanging="360"/>
+      </w:pPr>
+      <w:rPr>
+        <w:rFonts w:ascii="Wingdings" w:hAnsi="Wingdings" w:hint="default"/>
+        <w:sz w:val="20"/>
+      </w:rPr>
+    </w:lvl>
+    <w:lvl w:ilvl="7" w:tentative="1">
+      <w:start w:val="1"/>
+      <w:numFmt w:val="bullet"/>
+      <w:lvlText w:val=""/>
+      <w:lvlJc w:val="left"/>
+      <w:pPr>
+        <w:tabs>
+          <w:tab w:val="num" w:pos="5760"/>
+        </w:tabs>
+        <w:ind w:left="5760" w:hanging="360"/>
+      </w:pPr>
+      <w:rPr>
+        <w:rFonts w:ascii="Wingdings" w:hAnsi="Wingdings" w:hint="default"/>
+        <w:sz w:val="20"/>
+      </w:rPr>
+    </w:lvl>
+    <w:lvl w:ilvl="8" w:tentative="1">
+      <w:start w:val="1"/>
+      <w:numFmt w:val="bullet"/>
+      <w:lvlText w:val=""/>
+      <w:lvlJc w:val="left"/>
+      <w:pPr>
+        <w:tabs>
+          <w:tab w:val="num" w:pos="6480"/>
+        </w:tabs>
+        <w:ind w:left="6480" w:hanging="360"/>
+      </w:pPr>
+      <w:rPr>
+        <w:rFonts w:ascii="Wingdings" w:hAnsi="Wingdings" w:hint="default"/>
+        <w:sz w:val="20"/>
+      </w:rPr>
+    </w:lvl>
+  </w:abstractNum>
+  <w:abstractNum w:abstractNumId="11" w15:restartNumberingAfterBreak="0">
     <w:nsid w:val="779B3670"/>
     <w:multiLevelType w:val="multilevel"/>
     <w:tmpl w:val="67C0B20E"/>
@@ -2473,7 +5227,7 @@
       </w:pPr>
     </w:lvl>
   </w:abstractNum>
-  <w:abstractNum w:abstractNumId="7" w15:restartNumberingAfterBreak="0">
+  <w:abstractNum w:abstractNumId="12" w15:restartNumberingAfterBreak="0">
     <w:nsid w:val="796E3DE0"/>
     <w:multiLevelType w:val="multilevel"/>
     <w:tmpl w:val="06F8CE52"/>
@@ -2626,25 +5380,40 @@
     <w:abstractNumId w:val="1"/>
   </w:num>
   <w:num w:numId="2" w16cid:durableId="1839686408">
-    <w:abstractNumId w:val="4"/>
+    <w:abstractNumId w:val="8"/>
   </w:num>
   <w:num w:numId="3" w16cid:durableId="898368030">
     <w:abstractNumId w:val="0"/>
   </w:num>
   <w:num w:numId="4" w16cid:durableId="1848251355">
-    <w:abstractNumId w:val="5"/>
+    <w:abstractNumId w:val="9"/>
   </w:num>
   <w:num w:numId="5" w16cid:durableId="1813058266">
-    <w:abstractNumId w:val="3"/>
+    <w:abstractNumId w:val="7"/>
   </w:num>
   <w:num w:numId="6" w16cid:durableId="1659726100">
-    <w:abstractNumId w:val="7"/>
+    <w:abstractNumId w:val="12"/>
   </w:num>
   <w:num w:numId="7" w16cid:durableId="760879986">
-    <w:abstractNumId w:val="6"/>
+    <w:abstractNumId w:val="11"/>
   </w:num>
   <w:num w:numId="8" w16cid:durableId="118496818">
     <w:abstractNumId w:val="2"/>
+  </w:num>
+  <w:num w:numId="9" w16cid:durableId="1929078441">
+    <w:abstractNumId w:val="4"/>
+  </w:num>
+  <w:num w:numId="10" w16cid:durableId="514542132">
+    <w:abstractNumId w:val="3"/>
+  </w:num>
+  <w:num w:numId="11" w16cid:durableId="764157371">
+    <w:abstractNumId w:val="10"/>
+  </w:num>
+  <w:num w:numId="12" w16cid:durableId="2020810455">
+    <w:abstractNumId w:val="6"/>
+  </w:num>
+  <w:num w:numId="13" w16cid:durableId="663901112">
+    <w:abstractNumId w:val="5"/>
   </w:num>
 </w:numbering>
 </file>

</xml_diff>